<commit_message>
Add Cross-Domain Service entities to Entity Inventory v1.1
- Added 3 service-owned entities to Entity Map: Note (Notes Service,
  all domains), Survey and Survey Response (Survey Service, MN/CR)
- All 3 entities marked TBD for Native/Custom and Entity Type
  pending Entity PRD completion
- Updated totals: 12 CRM entities (2 native, 7 custom, 3 TBD),
  24 business entity concepts
- Updated Source Documents to reference Master PRD v2.1
- Added 3 rows to Cross-Domain Entity Matrix with dagger footnote
- Added item 6 to Next Steps for service entity PRDs
- Version 1.0 -> 1.1, Last Updated 04-04-26 21:45
</commit_message>
<xml_diff>
--- a/PRDs/CBM-Entity-Inventory.docx
+++ b/PRDs/CBM-Entity-Inventory.docx
@@ -309,7 +309,7 @@
                 <w:sz w:val="20"/>
                 <w:szCs w:val="20"/>
               </w:rPr>
-              <w:t xml:space="preserve">1.0</w:t>
+              <w:t xml:space="preserve">1.1</w:t>
             </w:r>
           </w:p>
         </w:tc>
@@ -439,7 +439,7 @@
                 <w:sz w:val="20"/>
                 <w:szCs w:val="20"/>
               </w:rPr>
-              <w:t xml:space="preserve">04-01-26 17:00</w:t>
+              <w:t xml:space="preserve">04-04-26 21:45</w:t>
             </w:r>
           </w:p>
         </w:tc>
@@ -594,7 +594,7 @@
           <w:sz w:val="22"/>
           <w:szCs w:val="22"/>
         </w:rPr>
-        <w:t xml:space="preserve">9 (2 native, 7 custom)</w:t>
+        <w:t xml:space="preserve">12 (2 native, 7 custom, 3 TBD)</w:t>
       </w:r>
     </w:p>
     <w:p>
@@ -623,7 +623,7 @@
           <w:sz w:val="22"/>
           <w:szCs w:val="22"/>
         </w:rPr>
-        <w:t xml:space="preserve">21</w:t>
+        <w:t xml:space="preserve">24</w:t>
       </w:r>
     </w:p>
     <w:p>
@@ -652,7 +652,7 @@
           <w:sz w:val="22"/>
           <w:szCs w:val="22"/>
         </w:rPr>
-        <w:t xml:space="preserve">Master PRD; Mentoring Domain PRD v1.0 (MN-INTAKE v2.1, MN-MATCH v2.1, MN-ENGAGE v2.3, MN-INACTIVE v1.2, MN-CLOSE v1.1). Mentor Recruitment, Client Recruiting, and Fundraising domains are represented at summary level from the Master PRD only.</w:t>
+        <w:t xml:space="preserve">Master PRD v2.1 (includes Cross-Domain Services); Mentoring Domain PRD v1.0 (MN-INTAKE v2.1, MN-MATCH v2.1, MN-ENGAGE v2.3, MN-INACTIVE v1.2, MN-CLOSE v1.1). Mentor Recruitment, Client Recruiting, and Fundraising domains are represented at summary level from the Master PRD only. Cross-Domain Service entities (Note, Survey, Survey Response) are at inventory level only — full requirements deferred to service process definition and Entity PRDs.</w:t>
       </w:r>
     </w:p>
     <w:p>
@@ -5400,6 +5400,670 @@
           </w:p>
         </w:tc>
       </w:tr>
+      <w:tr>
+        <w:tc>
+          <w:tcPr>
+            <w:tcW w:type="dxa" w:w="1700"/>
+            <w:tcBorders>
+              <w:top w:val="single" w:color="AAAAAA" w:sz="1"/>
+              <w:left w:val="single" w:color="AAAAAA" w:sz="1"/>
+              <w:bottom w:val="single" w:color="AAAAAA" w:sz="1"/>
+              <w:right w:val="single" w:color="AAAAAA" w:sz="1"/>
+            </w:tcBorders>
+            <w:tcMar>
+              <w:top w:type="dxa" w:w="60"/>
+              <w:left w:type="dxa" w:w="100"/>
+              <w:bottom w:type="dxa" w:w="60"/>
+              <w:right w:type="dxa" w:w="100"/>
+            </w:tcMar>
+          </w:tcPr>
+          <w:p>
+            <w:r>
+              <w:rPr>
+                <w:rFonts w:ascii="Arial" w:cs="Arial" w:eastAsia="Arial" w:hAnsi="Arial"/>
+                <w:b w:val="false"/>
+                <w:bCs w:val="false"/>
+                <w:i w:val="false"/>
+                <w:iCs w:val="false"/>
+                <w:sz w:val="16"/>
+                <w:szCs w:val="16"/>
+              </w:rPr>
+              <w:t xml:space="preserve">Note</w:t>
+            </w:r>
+          </w:p>
+        </w:tc>
+        <w:tc>
+          <w:tcPr>
+            <w:tcW w:type="dxa" w:w="1200"/>
+            <w:tcBorders>
+              <w:top w:val="single" w:color="AAAAAA" w:sz="1"/>
+              <w:left w:val="single" w:color="AAAAAA" w:sz="1"/>
+              <w:bottom w:val="single" w:color="AAAAAA" w:sz="1"/>
+              <w:right w:val="single" w:color="AAAAAA" w:sz="1"/>
+            </w:tcBorders>
+            <w:tcMar>
+              <w:top w:type="dxa" w:w="60"/>
+              <w:left w:type="dxa" w:w="100"/>
+              <w:bottom w:type="dxa" w:w="60"/>
+              <w:right w:type="dxa" w:w="100"/>
+            </w:tcMar>
+          </w:tcPr>
+          <w:p>
+            <w:r>
+              <w:rPr>
+                <w:rFonts w:ascii="Arial" w:cs="Arial" w:eastAsia="Arial" w:hAnsi="Arial"/>
+                <w:b w:val="false"/>
+                <w:bCs w:val="false"/>
+                <w:i w:val="false"/>
+                <w:iCs w:val="false"/>
+                <w:sz w:val="16"/>
+                <w:szCs w:val="16"/>
+              </w:rPr>
+              <w:t xml:space="preserve">Note</w:t>
+            </w:r>
+          </w:p>
+        </w:tc>
+        <w:tc>
+          <w:tcPr>
+            <w:tcW w:type="dxa" w:w="900"/>
+            <w:tcBorders>
+              <w:top w:val="single" w:color="AAAAAA" w:sz="1"/>
+              <w:left w:val="single" w:color="AAAAAA" w:sz="1"/>
+              <w:bottom w:val="single" w:color="AAAAAA" w:sz="1"/>
+              <w:right w:val="single" w:color="AAAAAA" w:sz="1"/>
+            </w:tcBorders>
+            <w:tcMar>
+              <w:top w:type="dxa" w:w="60"/>
+              <w:left w:type="dxa" w:w="100"/>
+              <w:bottom w:type="dxa" w:w="60"/>
+              <w:right w:type="dxa" w:w="100"/>
+            </w:tcMar>
+          </w:tcPr>
+          <w:p>
+            <w:r>
+              <w:rPr>
+                <w:rFonts w:ascii="Arial" w:cs="Arial" w:eastAsia="Arial" w:hAnsi="Arial"/>
+                <w:b w:val="false"/>
+                <w:bCs w:val="false"/>
+                <w:i w:val="false"/>
+                <w:iCs w:val="false"/>
+                <w:sz w:val="16"/>
+                <w:szCs w:val="16"/>
+              </w:rPr>
+              <w:t xml:space="preserve">TBD</w:t>
+            </w:r>
+          </w:p>
+        </w:tc>
+        <w:tc>
+          <w:tcPr>
+            <w:tcW w:type="dxa" w:w="900"/>
+            <w:tcBorders>
+              <w:top w:val="single" w:color="AAAAAA" w:sz="1"/>
+              <w:left w:val="single" w:color="AAAAAA" w:sz="1"/>
+              <w:bottom w:val="single" w:color="AAAAAA" w:sz="1"/>
+              <w:right w:val="single" w:color="AAAAAA" w:sz="1"/>
+            </w:tcBorders>
+            <w:tcMar>
+              <w:top w:type="dxa" w:w="60"/>
+              <w:left w:type="dxa" w:w="100"/>
+              <w:bottom w:type="dxa" w:w="60"/>
+              <w:right w:type="dxa" w:w="100"/>
+            </w:tcMar>
+          </w:tcPr>
+          <w:p>
+            <w:r>
+              <w:rPr>
+                <w:rFonts w:ascii="Arial" w:cs="Arial" w:eastAsia="Arial" w:hAnsi="Arial"/>
+                <w:b w:val="false"/>
+                <w:bCs w:val="false"/>
+                <w:i w:val="false"/>
+                <w:iCs w:val="false"/>
+                <w:sz w:val="16"/>
+                <w:szCs w:val="16"/>
+              </w:rPr>
+              <w:t xml:space="preserve">TBD</w:t>
+            </w:r>
+          </w:p>
+        </w:tc>
+        <w:tc>
+          <w:tcPr>
+            <w:tcW w:type="dxa" w:w="1200"/>
+            <w:tcBorders>
+              <w:top w:val="single" w:color="AAAAAA" w:sz="1"/>
+              <w:left w:val="single" w:color="AAAAAA" w:sz="1"/>
+              <w:bottom w:val="single" w:color="AAAAAA" w:sz="1"/>
+              <w:right w:val="single" w:color="AAAAAA" w:sz="1"/>
+            </w:tcBorders>
+            <w:tcMar>
+              <w:top w:type="dxa" w:w="60"/>
+              <w:left w:type="dxa" w:w="100"/>
+              <w:bottom w:type="dxa" w:w="60"/>
+              <w:right w:type="dxa" w:w="100"/>
+            </w:tcMar>
+          </w:tcPr>
+          <w:p>
+            <w:r>
+              <w:rPr>
+                <w:rFonts w:ascii="Arial" w:cs="Arial" w:eastAsia="Arial" w:hAnsi="Arial"/>
+                <w:b w:val="false"/>
+                <w:bCs w:val="false"/>
+                <w:i w:val="false"/>
+                <w:iCs w:val="false"/>
+                <w:sz w:val="16"/>
+                <w:szCs w:val="16"/>
+              </w:rPr>
+              <w:t xml:space="preserve">—</w:t>
+            </w:r>
+          </w:p>
+        </w:tc>
+        <w:tc>
+          <w:tcPr>
+            <w:tcW w:type="dxa" w:w="1300"/>
+            <w:tcBorders>
+              <w:top w:val="single" w:color="AAAAAA" w:sz="1"/>
+              <w:left w:val="single" w:color="AAAAAA" w:sz="1"/>
+              <w:bottom w:val="single" w:color="AAAAAA" w:sz="1"/>
+              <w:right w:val="single" w:color="AAAAAA" w:sz="1"/>
+            </w:tcBorders>
+            <w:tcMar>
+              <w:top w:type="dxa" w:w="60"/>
+              <w:left w:type="dxa" w:w="100"/>
+              <w:bottom w:type="dxa" w:w="60"/>
+              <w:right w:type="dxa" w:w="100"/>
+            </w:tcMar>
+          </w:tcPr>
+          <w:p>
+            <w:r>
+              <w:rPr>
+                <w:rFonts w:ascii="Arial" w:cs="Arial" w:eastAsia="Arial" w:hAnsi="Arial"/>
+                <w:b w:val="false"/>
+                <w:bCs w:val="false"/>
+                <w:i w:val="false"/>
+                <w:iCs w:val="false"/>
+                <w:sz w:val="16"/>
+                <w:szCs w:val="16"/>
+              </w:rPr>
+              <w:t xml:space="preserve">—</w:t>
+            </w:r>
+          </w:p>
+        </w:tc>
+        <w:tc>
+          <w:tcPr>
+            <w:tcW w:type="dxa" w:w="2160"/>
+            <w:tcBorders>
+              <w:top w:val="single" w:color="AAAAAA" w:sz="1"/>
+              <w:left w:val="single" w:color="AAAAAA" w:sz="1"/>
+              <w:bottom w:val="single" w:color="AAAAAA" w:sz="1"/>
+              <w:right w:val="single" w:color="AAAAAA" w:sz="1"/>
+            </w:tcBorders>
+            <w:tcMar>
+              <w:top w:type="dxa" w:w="60"/>
+              <w:left w:type="dxa" w:w="100"/>
+              <w:bottom w:type="dxa" w:w="60"/>
+              <w:right w:type="dxa" w:w="100"/>
+            </w:tcMar>
+          </w:tcPr>
+          <w:p>
+            <w:r>
+              <w:rPr>
+                <w:rFonts w:ascii="Arial" w:cs="Arial" w:eastAsia="Arial" w:hAnsi="Arial"/>
+                <w:b w:val="false"/>
+                <w:bCs w:val="false"/>
+                <w:i w:val="false"/>
+                <w:iCs w:val="false"/>
+                <w:sz w:val="16"/>
+                <w:szCs w:val="16"/>
+              </w:rPr>
+              <w:t xml:space="preserve">All (Notes Svc)</w:t>
+            </w:r>
+          </w:p>
+        </w:tc>
+      </w:tr>
+      <w:tr>
+        <w:tc>
+          <w:tcPr>
+            <w:tcW w:type="dxa" w:w="1700"/>
+            <w:tcBorders>
+              <w:top w:val="single" w:color="AAAAAA" w:sz="1"/>
+              <w:left w:val="single" w:color="AAAAAA" w:sz="1"/>
+              <w:bottom w:val="single" w:color="AAAAAA" w:sz="1"/>
+              <w:right w:val="single" w:color="AAAAAA" w:sz="1"/>
+            </w:tcBorders>
+            <w:shd w:fill="F2F7FB" w:val="clear"/>
+            <w:tcMar>
+              <w:top w:type="dxa" w:w="60"/>
+              <w:left w:type="dxa" w:w="100"/>
+              <w:bottom w:type="dxa" w:w="60"/>
+              <w:right w:type="dxa" w:w="100"/>
+            </w:tcMar>
+          </w:tcPr>
+          <w:p>
+            <w:r>
+              <w:rPr>
+                <w:rFonts w:ascii="Arial" w:cs="Arial" w:eastAsia="Arial" w:hAnsi="Arial"/>
+                <w:b w:val="false"/>
+                <w:bCs w:val="false"/>
+                <w:i w:val="false"/>
+                <w:iCs w:val="false"/>
+                <w:sz w:val="16"/>
+                <w:szCs w:val="16"/>
+              </w:rPr>
+              <w:t xml:space="preserve">Survey</w:t>
+            </w:r>
+          </w:p>
+        </w:tc>
+        <w:tc>
+          <w:tcPr>
+            <w:tcW w:type="dxa" w:w="1200"/>
+            <w:tcBorders>
+              <w:top w:val="single" w:color="AAAAAA" w:sz="1"/>
+              <w:left w:val="single" w:color="AAAAAA" w:sz="1"/>
+              <w:bottom w:val="single" w:color="AAAAAA" w:sz="1"/>
+              <w:right w:val="single" w:color="AAAAAA" w:sz="1"/>
+            </w:tcBorders>
+            <w:shd w:fill="F2F7FB" w:val="clear"/>
+            <w:tcMar>
+              <w:top w:type="dxa" w:w="60"/>
+              <w:left w:type="dxa" w:w="100"/>
+              <w:bottom w:type="dxa" w:w="60"/>
+              <w:right w:type="dxa" w:w="100"/>
+            </w:tcMar>
+          </w:tcPr>
+          <w:p>
+            <w:r>
+              <w:rPr>
+                <w:rFonts w:ascii="Arial" w:cs="Arial" w:eastAsia="Arial" w:hAnsi="Arial"/>
+                <w:b w:val="false"/>
+                <w:bCs w:val="false"/>
+                <w:i w:val="false"/>
+                <w:iCs w:val="false"/>
+                <w:sz w:val="16"/>
+                <w:szCs w:val="16"/>
+              </w:rPr>
+              <w:t xml:space="preserve">Survey</w:t>
+            </w:r>
+          </w:p>
+        </w:tc>
+        <w:tc>
+          <w:tcPr>
+            <w:tcW w:type="dxa" w:w="900"/>
+            <w:tcBorders>
+              <w:top w:val="single" w:color="AAAAAA" w:sz="1"/>
+              <w:left w:val="single" w:color="AAAAAA" w:sz="1"/>
+              <w:bottom w:val="single" w:color="AAAAAA" w:sz="1"/>
+              <w:right w:val="single" w:color="AAAAAA" w:sz="1"/>
+            </w:tcBorders>
+            <w:shd w:fill="F2F7FB" w:val="clear"/>
+            <w:tcMar>
+              <w:top w:type="dxa" w:w="60"/>
+              <w:left w:type="dxa" w:w="100"/>
+              <w:bottom w:type="dxa" w:w="60"/>
+              <w:right w:type="dxa" w:w="100"/>
+            </w:tcMar>
+          </w:tcPr>
+          <w:p>
+            <w:r>
+              <w:rPr>
+                <w:rFonts w:ascii="Arial" w:cs="Arial" w:eastAsia="Arial" w:hAnsi="Arial"/>
+                <w:b w:val="false"/>
+                <w:bCs w:val="false"/>
+                <w:i w:val="false"/>
+                <w:iCs w:val="false"/>
+                <w:sz w:val="16"/>
+                <w:szCs w:val="16"/>
+              </w:rPr>
+              <w:t xml:space="preserve">TBD</w:t>
+            </w:r>
+          </w:p>
+        </w:tc>
+        <w:tc>
+          <w:tcPr>
+            <w:tcW w:type="dxa" w:w="900"/>
+            <w:tcBorders>
+              <w:top w:val="single" w:color="AAAAAA" w:sz="1"/>
+              <w:left w:val="single" w:color="AAAAAA" w:sz="1"/>
+              <w:bottom w:val="single" w:color="AAAAAA" w:sz="1"/>
+              <w:right w:val="single" w:color="AAAAAA" w:sz="1"/>
+            </w:tcBorders>
+            <w:shd w:fill="F2F7FB" w:val="clear"/>
+            <w:tcMar>
+              <w:top w:type="dxa" w:w="60"/>
+              <w:left w:type="dxa" w:w="100"/>
+              <w:bottom w:type="dxa" w:w="60"/>
+              <w:right w:type="dxa" w:w="100"/>
+            </w:tcMar>
+          </w:tcPr>
+          <w:p>
+            <w:r>
+              <w:rPr>
+                <w:rFonts w:ascii="Arial" w:cs="Arial" w:eastAsia="Arial" w:hAnsi="Arial"/>
+                <w:b w:val="false"/>
+                <w:bCs w:val="false"/>
+                <w:i w:val="false"/>
+                <w:iCs w:val="false"/>
+                <w:sz w:val="16"/>
+                <w:szCs w:val="16"/>
+              </w:rPr>
+              <w:t xml:space="preserve">TBD</w:t>
+            </w:r>
+          </w:p>
+        </w:tc>
+        <w:tc>
+          <w:tcPr>
+            <w:tcW w:type="dxa" w:w="1200"/>
+            <w:tcBorders>
+              <w:top w:val="single" w:color="AAAAAA" w:sz="1"/>
+              <w:left w:val="single" w:color="AAAAAA" w:sz="1"/>
+              <w:bottom w:val="single" w:color="AAAAAA" w:sz="1"/>
+              <w:right w:val="single" w:color="AAAAAA" w:sz="1"/>
+            </w:tcBorders>
+            <w:shd w:fill="F2F7FB" w:val="clear"/>
+            <w:tcMar>
+              <w:top w:type="dxa" w:w="60"/>
+              <w:left w:type="dxa" w:w="100"/>
+              <w:bottom w:type="dxa" w:w="60"/>
+              <w:right w:type="dxa" w:w="100"/>
+            </w:tcMar>
+          </w:tcPr>
+          <w:p>
+            <w:r>
+              <w:rPr>
+                <w:rFonts w:ascii="Arial" w:cs="Arial" w:eastAsia="Arial" w:hAnsi="Arial"/>
+                <w:b w:val="false"/>
+                <w:bCs w:val="false"/>
+                <w:i w:val="false"/>
+                <w:iCs w:val="false"/>
+                <w:sz w:val="16"/>
+                <w:szCs w:val="16"/>
+              </w:rPr>
+              <w:t xml:space="preserve">—</w:t>
+            </w:r>
+          </w:p>
+        </w:tc>
+        <w:tc>
+          <w:tcPr>
+            <w:tcW w:type="dxa" w:w="1300"/>
+            <w:tcBorders>
+              <w:top w:val="single" w:color="AAAAAA" w:sz="1"/>
+              <w:left w:val="single" w:color="AAAAAA" w:sz="1"/>
+              <w:bottom w:val="single" w:color="AAAAAA" w:sz="1"/>
+              <w:right w:val="single" w:color="AAAAAA" w:sz="1"/>
+            </w:tcBorders>
+            <w:shd w:fill="F2F7FB" w:val="clear"/>
+            <w:tcMar>
+              <w:top w:type="dxa" w:w="60"/>
+              <w:left w:type="dxa" w:w="100"/>
+              <w:bottom w:type="dxa" w:w="60"/>
+              <w:right w:type="dxa" w:w="100"/>
+            </w:tcMar>
+          </w:tcPr>
+          <w:p>
+            <w:r>
+              <w:rPr>
+                <w:rFonts w:ascii="Arial" w:cs="Arial" w:eastAsia="Arial" w:hAnsi="Arial"/>
+                <w:b w:val="false"/>
+                <w:bCs w:val="false"/>
+                <w:i w:val="false"/>
+                <w:iCs w:val="false"/>
+                <w:sz w:val="16"/>
+                <w:szCs w:val="16"/>
+              </w:rPr>
+              <w:t xml:space="preserve">—</w:t>
+            </w:r>
+          </w:p>
+        </w:tc>
+        <w:tc>
+          <w:tcPr>
+            <w:tcW w:type="dxa" w:w="2160"/>
+            <w:tcBorders>
+              <w:top w:val="single" w:color="AAAAAA" w:sz="1"/>
+              <w:left w:val="single" w:color="AAAAAA" w:sz="1"/>
+              <w:bottom w:val="single" w:color="AAAAAA" w:sz="1"/>
+              <w:right w:val="single" w:color="AAAAAA" w:sz="1"/>
+            </w:tcBorders>
+            <w:shd w:fill="F2F7FB" w:val="clear"/>
+            <w:tcMar>
+              <w:top w:type="dxa" w:w="60"/>
+              <w:left w:type="dxa" w:w="100"/>
+              <w:bottom w:type="dxa" w:w="60"/>
+              <w:right w:type="dxa" w:w="100"/>
+            </w:tcMar>
+          </w:tcPr>
+          <w:p>
+            <w:r>
+              <w:rPr>
+                <w:rFonts w:ascii="Arial" w:cs="Arial" w:eastAsia="Arial" w:hAnsi="Arial"/>
+                <w:b w:val="false"/>
+                <w:bCs w:val="false"/>
+                <w:i w:val="false"/>
+                <w:iCs w:val="false"/>
+                <w:sz w:val="16"/>
+                <w:szCs w:val="16"/>
+              </w:rPr>
+              <w:t xml:space="preserve">MN, CR (Survey Svc)</w:t>
+            </w:r>
+          </w:p>
+        </w:tc>
+      </w:tr>
+      <w:tr>
+        <w:tc>
+          <w:tcPr>
+            <w:tcW w:type="dxa" w:w="1700"/>
+            <w:tcBorders>
+              <w:top w:val="single" w:color="AAAAAA" w:sz="1"/>
+              <w:left w:val="single" w:color="AAAAAA" w:sz="1"/>
+              <w:bottom w:val="single" w:color="AAAAAA" w:sz="1"/>
+              <w:right w:val="single" w:color="AAAAAA" w:sz="1"/>
+            </w:tcBorders>
+            <w:tcMar>
+              <w:top w:type="dxa" w:w="60"/>
+              <w:left w:type="dxa" w:w="100"/>
+              <w:bottom w:type="dxa" w:w="60"/>
+              <w:right w:type="dxa" w:w="100"/>
+            </w:tcMar>
+          </w:tcPr>
+          <w:p>
+            <w:r>
+              <w:rPr>
+                <w:rFonts w:ascii="Arial" w:cs="Arial" w:eastAsia="Arial" w:hAnsi="Arial"/>
+                <w:b w:val="false"/>
+                <w:bCs w:val="false"/>
+                <w:i w:val="false"/>
+                <w:iCs w:val="false"/>
+                <w:sz w:val="16"/>
+                <w:szCs w:val="16"/>
+              </w:rPr>
+              <w:t xml:space="preserve">Survey Response</w:t>
+            </w:r>
+          </w:p>
+        </w:tc>
+        <w:tc>
+          <w:tcPr>
+            <w:tcW w:type="dxa" w:w="1200"/>
+            <w:tcBorders>
+              <w:top w:val="single" w:color="AAAAAA" w:sz="1"/>
+              <w:left w:val="single" w:color="AAAAAA" w:sz="1"/>
+              <w:bottom w:val="single" w:color="AAAAAA" w:sz="1"/>
+              <w:right w:val="single" w:color="AAAAAA" w:sz="1"/>
+            </w:tcBorders>
+            <w:tcMar>
+              <w:top w:type="dxa" w:w="60"/>
+              <w:left w:type="dxa" w:w="100"/>
+              <w:bottom w:type="dxa" w:w="60"/>
+              <w:right w:type="dxa" w:w="100"/>
+            </w:tcMar>
+          </w:tcPr>
+          <w:p>
+            <w:r>
+              <w:rPr>
+                <w:rFonts w:ascii="Arial" w:cs="Arial" w:eastAsia="Arial" w:hAnsi="Arial"/>
+                <w:b w:val="false"/>
+                <w:bCs w:val="false"/>
+                <w:i w:val="false"/>
+                <w:iCs w:val="false"/>
+                <w:sz w:val="16"/>
+                <w:szCs w:val="16"/>
+              </w:rPr>
+              <w:t xml:space="preserve">Survey Response</w:t>
+            </w:r>
+          </w:p>
+        </w:tc>
+        <w:tc>
+          <w:tcPr>
+            <w:tcW w:type="dxa" w:w="900"/>
+            <w:tcBorders>
+              <w:top w:val="single" w:color="AAAAAA" w:sz="1"/>
+              <w:left w:val="single" w:color="AAAAAA" w:sz="1"/>
+              <w:bottom w:val="single" w:color="AAAAAA" w:sz="1"/>
+              <w:right w:val="single" w:color="AAAAAA" w:sz="1"/>
+            </w:tcBorders>
+            <w:tcMar>
+              <w:top w:type="dxa" w:w="60"/>
+              <w:left w:type="dxa" w:w="100"/>
+              <w:bottom w:type="dxa" w:w="60"/>
+              <w:right w:type="dxa" w:w="100"/>
+            </w:tcMar>
+          </w:tcPr>
+          <w:p>
+            <w:r>
+              <w:rPr>
+                <w:rFonts w:ascii="Arial" w:cs="Arial" w:eastAsia="Arial" w:hAnsi="Arial"/>
+                <w:b w:val="false"/>
+                <w:bCs w:val="false"/>
+                <w:i w:val="false"/>
+                <w:iCs w:val="false"/>
+                <w:sz w:val="16"/>
+                <w:szCs w:val="16"/>
+              </w:rPr>
+              <w:t xml:space="preserve">TBD</w:t>
+            </w:r>
+          </w:p>
+        </w:tc>
+        <w:tc>
+          <w:tcPr>
+            <w:tcW w:type="dxa" w:w="900"/>
+            <w:tcBorders>
+              <w:top w:val="single" w:color="AAAAAA" w:sz="1"/>
+              <w:left w:val="single" w:color="AAAAAA" w:sz="1"/>
+              <w:bottom w:val="single" w:color="AAAAAA" w:sz="1"/>
+              <w:right w:val="single" w:color="AAAAAA" w:sz="1"/>
+            </w:tcBorders>
+            <w:tcMar>
+              <w:top w:type="dxa" w:w="60"/>
+              <w:left w:type="dxa" w:w="100"/>
+              <w:bottom w:type="dxa" w:w="60"/>
+              <w:right w:type="dxa" w:w="100"/>
+            </w:tcMar>
+          </w:tcPr>
+          <w:p>
+            <w:r>
+              <w:rPr>
+                <w:rFonts w:ascii="Arial" w:cs="Arial" w:eastAsia="Arial" w:hAnsi="Arial"/>
+                <w:b w:val="false"/>
+                <w:bCs w:val="false"/>
+                <w:i w:val="false"/>
+                <w:iCs w:val="false"/>
+                <w:sz w:val="16"/>
+                <w:szCs w:val="16"/>
+              </w:rPr>
+              <w:t xml:space="preserve">TBD</w:t>
+            </w:r>
+          </w:p>
+        </w:tc>
+        <w:tc>
+          <w:tcPr>
+            <w:tcW w:type="dxa" w:w="1200"/>
+            <w:tcBorders>
+              <w:top w:val="single" w:color="AAAAAA" w:sz="1"/>
+              <w:left w:val="single" w:color="AAAAAA" w:sz="1"/>
+              <w:bottom w:val="single" w:color="AAAAAA" w:sz="1"/>
+              <w:right w:val="single" w:color="AAAAAA" w:sz="1"/>
+            </w:tcBorders>
+            <w:tcMar>
+              <w:top w:type="dxa" w:w="60"/>
+              <w:left w:type="dxa" w:w="100"/>
+              <w:bottom w:type="dxa" w:w="60"/>
+              <w:right w:type="dxa" w:w="100"/>
+            </w:tcMar>
+          </w:tcPr>
+          <w:p>
+            <w:r>
+              <w:rPr>
+                <w:rFonts w:ascii="Arial" w:cs="Arial" w:eastAsia="Arial" w:hAnsi="Arial"/>
+                <w:b w:val="false"/>
+                <w:bCs w:val="false"/>
+                <w:i w:val="false"/>
+                <w:iCs w:val="false"/>
+                <w:sz w:val="16"/>
+                <w:szCs w:val="16"/>
+              </w:rPr>
+              <w:t xml:space="preserve">—</w:t>
+            </w:r>
+          </w:p>
+        </w:tc>
+        <w:tc>
+          <w:tcPr>
+            <w:tcW w:type="dxa" w:w="1300"/>
+            <w:tcBorders>
+              <w:top w:val="single" w:color="AAAAAA" w:sz="1"/>
+              <w:left w:val="single" w:color="AAAAAA" w:sz="1"/>
+              <w:bottom w:val="single" w:color="AAAAAA" w:sz="1"/>
+              <w:right w:val="single" w:color="AAAAAA" w:sz="1"/>
+            </w:tcBorders>
+            <w:tcMar>
+              <w:top w:type="dxa" w:w="60"/>
+              <w:left w:type="dxa" w:w="100"/>
+              <w:bottom w:type="dxa" w:w="60"/>
+              <w:right w:type="dxa" w:w="100"/>
+            </w:tcMar>
+          </w:tcPr>
+          <w:p>
+            <w:r>
+              <w:rPr>
+                <w:rFonts w:ascii="Arial" w:cs="Arial" w:eastAsia="Arial" w:hAnsi="Arial"/>
+                <w:b w:val="false"/>
+                <w:bCs w:val="false"/>
+                <w:i w:val="false"/>
+                <w:iCs w:val="false"/>
+                <w:sz w:val="16"/>
+                <w:szCs w:val="16"/>
+              </w:rPr>
+              <w:t xml:space="preserve">—</w:t>
+            </w:r>
+          </w:p>
+        </w:tc>
+        <w:tc>
+          <w:tcPr>
+            <w:tcW w:type="dxa" w:w="2160"/>
+            <w:tcBorders>
+              <w:top w:val="single" w:color="AAAAAA" w:sz="1"/>
+              <w:left w:val="single" w:color="AAAAAA" w:sz="1"/>
+              <w:bottom w:val="single" w:color="AAAAAA" w:sz="1"/>
+              <w:right w:val="single" w:color="AAAAAA" w:sz="1"/>
+            </w:tcBorders>
+            <w:tcMar>
+              <w:top w:type="dxa" w:w="60"/>
+              <w:left w:type="dxa" w:w="100"/>
+              <w:bottom w:type="dxa" w:w="60"/>
+              <w:right w:type="dxa" w:w="100"/>
+            </w:tcMar>
+          </w:tcPr>
+          <w:p>
+            <w:r>
+              <w:rPr>
+                <w:rFonts w:ascii="Arial" w:cs="Arial" w:eastAsia="Arial" w:hAnsi="Arial"/>
+                <w:b w:val="false"/>
+                <w:bCs w:val="false"/>
+                <w:i w:val="false"/>
+                <w:iCs w:val="false"/>
+                <w:sz w:val="16"/>
+                <w:szCs w:val="16"/>
+              </w:rPr>
+              <w:t xml:space="preserve">MN, CR (Survey Svc)</w:t>
+            </w:r>
+          </w:p>
+        </w:tc>
+      </w:tr>
     </w:tbl>
     <w:p>
       <w:r>
@@ -11524,6 +12188,627 @@
           </w:p>
         </w:tc>
       </w:tr>
+      <w:tr>
+        <w:tc>
+          <w:tcPr>
+            <w:tcW w:type="dxa" w:w="2400"/>
+            <w:tcBorders>
+              <w:top w:val="single" w:color="AAAAAA" w:sz="1"/>
+              <w:left w:val="single" w:color="AAAAAA" w:sz="1"/>
+              <w:bottom w:val="single" w:color="AAAAAA" w:sz="1"/>
+              <w:right w:val="single" w:color="AAAAAA" w:sz="1"/>
+            </w:tcBorders>
+            <w:shd w:fill="F2F7FB" w:val="clear"/>
+            <w:tcMar>
+              <w:top w:type="dxa" w:w="60"/>
+              <w:left w:type="dxa" w:w="100"/>
+              <w:bottom w:type="dxa" w:w="60"/>
+              <w:right w:type="dxa" w:w="100"/>
+            </w:tcMar>
+          </w:tcPr>
+          <w:p>
+            <w:r>
+              <w:rPr>
+                <w:rFonts w:ascii="Arial" w:cs="Arial" w:eastAsia="Arial" w:hAnsi="Arial"/>
+                <w:b/>
+                <w:bCs/>
+                <w:i w:val="false"/>
+                <w:iCs w:val="false"/>
+                <w:sz w:val="20"/>
+                <w:szCs w:val="20"/>
+              </w:rPr>
+              <w:t xml:space="preserve">Note †</w:t>
+            </w:r>
+          </w:p>
+        </w:tc>
+        <w:tc>
+          <w:tcPr>
+            <w:tcW w:type="dxa" w:w="1240"/>
+            <w:tcBorders>
+              <w:top w:val="single" w:color="AAAAAA" w:sz="1"/>
+              <w:left w:val="single" w:color="AAAAAA" w:sz="1"/>
+              <w:bottom w:val="single" w:color="AAAAAA" w:sz="1"/>
+              <w:right w:val="single" w:color="AAAAAA" w:sz="1"/>
+            </w:tcBorders>
+            <w:shd w:fill="F2F7FB" w:val="clear"/>
+            <w:tcMar>
+              <w:top w:type="dxa" w:w="60"/>
+              <w:left w:type="dxa" w:w="100"/>
+              <w:bottom w:type="dxa" w:w="60"/>
+              <w:right w:type="dxa" w:w="100"/>
+            </w:tcMar>
+          </w:tcPr>
+          <w:p>
+            <w:pPr>
+              <w:jc w:val="center"/>
+            </w:pPr>
+            <w:r>
+              <w:rPr>
+                <w:rFonts w:ascii="Arial" w:cs="Arial" w:eastAsia="Arial" w:hAnsi="Arial"/>
+                <w:b w:val="false"/>
+                <w:bCs w:val="false"/>
+                <w:i w:val="false"/>
+                <w:iCs w:val="false"/>
+                <w:sz w:val="20"/>
+                <w:szCs w:val="20"/>
+              </w:rPr>
+              <w:t xml:space="preserve">✓</w:t>
+            </w:r>
+          </w:p>
+        </w:tc>
+        <w:tc>
+          <w:tcPr>
+            <w:tcW w:type="dxa" w:w="1240"/>
+            <w:tcBorders>
+              <w:top w:val="single" w:color="AAAAAA" w:sz="1"/>
+              <w:left w:val="single" w:color="AAAAAA" w:sz="1"/>
+              <w:bottom w:val="single" w:color="AAAAAA" w:sz="1"/>
+              <w:right w:val="single" w:color="AAAAAA" w:sz="1"/>
+            </w:tcBorders>
+            <w:shd w:fill="F2F7FB" w:val="clear"/>
+            <w:tcMar>
+              <w:top w:type="dxa" w:w="60"/>
+              <w:left w:type="dxa" w:w="100"/>
+              <w:bottom w:type="dxa" w:w="60"/>
+              <w:right w:type="dxa" w:w="100"/>
+            </w:tcMar>
+          </w:tcPr>
+          <w:p>
+            <w:pPr>
+              <w:jc w:val="center"/>
+            </w:pPr>
+            <w:r>
+              <w:rPr>
+                <w:rFonts w:ascii="Arial" w:cs="Arial" w:eastAsia="Arial" w:hAnsi="Arial"/>
+                <w:b w:val="false"/>
+                <w:bCs w:val="false"/>
+                <w:i w:val="false"/>
+                <w:iCs w:val="false"/>
+                <w:sz w:val="20"/>
+                <w:szCs w:val="20"/>
+              </w:rPr>
+              <w:t xml:space="preserve">✓</w:t>
+            </w:r>
+          </w:p>
+        </w:tc>
+        <w:tc>
+          <w:tcPr>
+            <w:tcW w:type="dxa" w:w="1240"/>
+            <w:tcBorders>
+              <w:top w:val="single" w:color="AAAAAA" w:sz="1"/>
+              <w:left w:val="single" w:color="AAAAAA" w:sz="1"/>
+              <w:bottom w:val="single" w:color="AAAAAA" w:sz="1"/>
+              <w:right w:val="single" w:color="AAAAAA" w:sz="1"/>
+            </w:tcBorders>
+            <w:shd w:fill="F2F7FB" w:val="clear"/>
+            <w:tcMar>
+              <w:top w:type="dxa" w:w="60"/>
+              <w:left w:type="dxa" w:w="100"/>
+              <w:bottom w:type="dxa" w:w="60"/>
+              <w:right w:type="dxa" w:w="100"/>
+            </w:tcMar>
+          </w:tcPr>
+          <w:p>
+            <w:pPr>
+              <w:jc w:val="center"/>
+            </w:pPr>
+            <w:r>
+              <w:rPr>
+                <w:rFonts w:ascii="Arial" w:cs="Arial" w:eastAsia="Arial" w:hAnsi="Arial"/>
+                <w:b w:val="false"/>
+                <w:bCs w:val="false"/>
+                <w:i w:val="false"/>
+                <w:iCs w:val="false"/>
+                <w:sz w:val="20"/>
+                <w:szCs w:val="20"/>
+              </w:rPr>
+              <w:t xml:space="preserve">✓</w:t>
+            </w:r>
+          </w:p>
+        </w:tc>
+        <w:tc>
+          <w:tcPr>
+            <w:tcW w:type="dxa" w:w="1240"/>
+            <w:tcBorders>
+              <w:top w:val="single" w:color="AAAAAA" w:sz="1"/>
+              <w:left w:val="single" w:color="AAAAAA" w:sz="1"/>
+              <w:bottom w:val="single" w:color="AAAAAA" w:sz="1"/>
+              <w:right w:val="single" w:color="AAAAAA" w:sz="1"/>
+            </w:tcBorders>
+            <w:shd w:fill="F2F7FB" w:val="clear"/>
+            <w:tcMar>
+              <w:top w:type="dxa" w:w="60"/>
+              <w:left w:type="dxa" w:w="100"/>
+              <w:bottom w:type="dxa" w:w="60"/>
+              <w:right w:type="dxa" w:w="100"/>
+            </w:tcMar>
+          </w:tcPr>
+          <w:p>
+            <w:pPr>
+              <w:jc w:val="center"/>
+            </w:pPr>
+            <w:r>
+              <w:rPr>
+                <w:rFonts w:ascii="Arial" w:cs="Arial" w:eastAsia="Arial" w:hAnsi="Arial"/>
+                <w:b w:val="false"/>
+                <w:bCs w:val="false"/>
+                <w:i w:val="false"/>
+                <w:iCs w:val="false"/>
+                <w:sz w:val="20"/>
+                <w:szCs w:val="20"/>
+              </w:rPr>
+              <w:t xml:space="preserve">✓</w:t>
+            </w:r>
+          </w:p>
+        </w:tc>
+        <w:tc>
+          <w:tcPr>
+            <w:tcW w:type="dxa" w:w="2000"/>
+            <w:tcBorders>
+              <w:top w:val="single" w:color="AAAAAA" w:sz="1"/>
+              <w:left w:val="single" w:color="AAAAAA" w:sz="1"/>
+              <w:bottom w:val="single" w:color="AAAAAA" w:sz="1"/>
+              <w:right w:val="single" w:color="AAAAAA" w:sz="1"/>
+            </w:tcBorders>
+            <w:shd w:fill="F2F7FB" w:val="clear"/>
+            <w:tcMar>
+              <w:top w:type="dxa" w:w="60"/>
+              <w:left w:type="dxa" w:w="100"/>
+              <w:bottom w:type="dxa" w:w="60"/>
+              <w:right w:type="dxa" w:w="100"/>
+            </w:tcMar>
+          </w:tcPr>
+          <w:p>
+            <w:pPr>
+              <w:jc w:val="center"/>
+            </w:pPr>
+            <w:r>
+              <w:rPr>
+                <w:rFonts w:ascii="Arial" w:cs="Arial" w:eastAsia="Arial" w:hAnsi="Arial"/>
+                <w:b w:val="false"/>
+                <w:bCs w:val="false"/>
+                <w:i w:val="false"/>
+                <w:iCs w:val="false"/>
+                <w:sz w:val="20"/>
+                <w:szCs w:val="20"/>
+              </w:rPr>
+              <w:t xml:space="preserve">4 (all)</w:t>
+            </w:r>
+          </w:p>
+        </w:tc>
+      </w:tr>
+      <w:tr>
+        <w:tc>
+          <w:tcPr>
+            <w:tcW w:type="dxa" w:w="2400"/>
+            <w:tcBorders>
+              <w:top w:val="single" w:color="AAAAAA" w:sz="1"/>
+              <w:left w:val="single" w:color="AAAAAA" w:sz="1"/>
+              <w:bottom w:val="single" w:color="AAAAAA" w:sz="1"/>
+              <w:right w:val="single" w:color="AAAAAA" w:sz="1"/>
+            </w:tcBorders>
+            <w:tcMar>
+              <w:top w:type="dxa" w:w="60"/>
+              <w:left w:type="dxa" w:w="100"/>
+              <w:bottom w:type="dxa" w:w="60"/>
+              <w:right w:type="dxa" w:w="100"/>
+            </w:tcMar>
+          </w:tcPr>
+          <w:p>
+            <w:r>
+              <w:rPr>
+                <w:rFonts w:ascii="Arial" w:cs="Arial" w:eastAsia="Arial" w:hAnsi="Arial"/>
+                <w:b/>
+                <w:bCs/>
+                <w:i w:val="false"/>
+                <w:iCs w:val="false"/>
+                <w:sz w:val="20"/>
+                <w:szCs w:val="20"/>
+              </w:rPr>
+              <w:t xml:space="preserve">Survey †</w:t>
+            </w:r>
+          </w:p>
+        </w:tc>
+        <w:tc>
+          <w:tcPr>
+            <w:tcW w:type="dxa" w:w="1240"/>
+            <w:tcBorders>
+              <w:top w:val="single" w:color="AAAAAA" w:sz="1"/>
+              <w:left w:val="single" w:color="AAAAAA" w:sz="1"/>
+              <w:bottom w:val="single" w:color="AAAAAA" w:sz="1"/>
+              <w:right w:val="single" w:color="AAAAAA" w:sz="1"/>
+            </w:tcBorders>
+            <w:tcMar>
+              <w:top w:type="dxa" w:w="60"/>
+              <w:left w:type="dxa" w:w="100"/>
+              <w:bottom w:type="dxa" w:w="60"/>
+              <w:right w:type="dxa" w:w="100"/>
+            </w:tcMar>
+          </w:tcPr>
+          <w:p>
+            <w:pPr>
+              <w:jc w:val="center"/>
+            </w:pPr>
+            <w:r>
+              <w:rPr>
+                <w:rFonts w:ascii="Arial" w:cs="Arial" w:eastAsia="Arial" w:hAnsi="Arial"/>
+                <w:b w:val="false"/>
+                <w:bCs w:val="false"/>
+                <w:i w:val="false"/>
+                <w:iCs w:val="false"/>
+                <w:sz w:val="20"/>
+                <w:szCs w:val="20"/>
+              </w:rPr>
+              <w:t xml:space="preserve">✓</w:t>
+            </w:r>
+          </w:p>
+        </w:tc>
+        <w:tc>
+          <w:tcPr>
+            <w:tcW w:type="dxa" w:w="1240"/>
+            <w:tcBorders>
+              <w:top w:val="single" w:color="AAAAAA" w:sz="1"/>
+              <w:left w:val="single" w:color="AAAAAA" w:sz="1"/>
+              <w:bottom w:val="single" w:color="AAAAAA" w:sz="1"/>
+              <w:right w:val="single" w:color="AAAAAA" w:sz="1"/>
+            </w:tcBorders>
+            <w:tcMar>
+              <w:top w:type="dxa" w:w="60"/>
+              <w:left w:type="dxa" w:w="100"/>
+              <w:bottom w:type="dxa" w:w="60"/>
+              <w:right w:type="dxa" w:w="100"/>
+            </w:tcMar>
+          </w:tcPr>
+          <w:p>
+            <w:pPr>
+              <w:jc w:val="center"/>
+            </w:pPr>
+            <w:r>
+              <w:rPr>
+                <w:rFonts w:ascii="Arial" w:cs="Arial" w:eastAsia="Arial" w:hAnsi="Arial"/>
+                <w:b w:val="false"/>
+                <w:bCs w:val="false"/>
+                <w:i w:val="false"/>
+                <w:iCs w:val="false"/>
+                <w:sz w:val="20"/>
+                <w:szCs w:val="20"/>
+              </w:rPr>
+              <w:t xml:space="preserve"/>
+            </w:r>
+          </w:p>
+        </w:tc>
+        <w:tc>
+          <w:tcPr>
+            <w:tcW w:type="dxa" w:w="1240"/>
+            <w:tcBorders>
+              <w:top w:val="single" w:color="AAAAAA" w:sz="1"/>
+              <w:left w:val="single" w:color="AAAAAA" w:sz="1"/>
+              <w:bottom w:val="single" w:color="AAAAAA" w:sz="1"/>
+              <w:right w:val="single" w:color="AAAAAA" w:sz="1"/>
+            </w:tcBorders>
+            <w:tcMar>
+              <w:top w:type="dxa" w:w="60"/>
+              <w:left w:type="dxa" w:w="100"/>
+              <w:bottom w:type="dxa" w:w="60"/>
+              <w:right w:type="dxa" w:w="100"/>
+            </w:tcMar>
+          </w:tcPr>
+          <w:p>
+            <w:pPr>
+              <w:jc w:val="center"/>
+            </w:pPr>
+            <w:r>
+              <w:rPr>
+                <w:rFonts w:ascii="Arial" w:cs="Arial" w:eastAsia="Arial" w:hAnsi="Arial"/>
+                <w:b w:val="false"/>
+                <w:bCs w:val="false"/>
+                <w:i w:val="false"/>
+                <w:iCs w:val="false"/>
+                <w:sz w:val="20"/>
+                <w:szCs w:val="20"/>
+              </w:rPr>
+              <w:t xml:space="preserve">✓</w:t>
+            </w:r>
+          </w:p>
+        </w:tc>
+        <w:tc>
+          <w:tcPr>
+            <w:tcW w:type="dxa" w:w="1240"/>
+            <w:tcBorders>
+              <w:top w:val="single" w:color="AAAAAA" w:sz="1"/>
+              <w:left w:val="single" w:color="AAAAAA" w:sz="1"/>
+              <w:bottom w:val="single" w:color="AAAAAA" w:sz="1"/>
+              <w:right w:val="single" w:color="AAAAAA" w:sz="1"/>
+            </w:tcBorders>
+            <w:tcMar>
+              <w:top w:type="dxa" w:w="60"/>
+              <w:left w:type="dxa" w:w="100"/>
+              <w:bottom w:type="dxa" w:w="60"/>
+              <w:right w:type="dxa" w:w="100"/>
+            </w:tcMar>
+          </w:tcPr>
+          <w:p>
+            <w:pPr>
+              <w:jc w:val="center"/>
+            </w:pPr>
+            <w:r>
+              <w:rPr>
+                <w:rFonts w:ascii="Arial" w:cs="Arial" w:eastAsia="Arial" w:hAnsi="Arial"/>
+                <w:b w:val="false"/>
+                <w:bCs w:val="false"/>
+                <w:i w:val="false"/>
+                <w:iCs w:val="false"/>
+                <w:sz w:val="20"/>
+                <w:szCs w:val="20"/>
+              </w:rPr>
+              <w:t xml:space="preserve"/>
+            </w:r>
+          </w:p>
+        </w:tc>
+        <w:tc>
+          <w:tcPr>
+            <w:tcW w:type="dxa" w:w="2000"/>
+            <w:tcBorders>
+              <w:top w:val="single" w:color="AAAAAA" w:sz="1"/>
+              <w:left w:val="single" w:color="AAAAAA" w:sz="1"/>
+              <w:bottom w:val="single" w:color="AAAAAA" w:sz="1"/>
+              <w:right w:val="single" w:color="AAAAAA" w:sz="1"/>
+            </w:tcBorders>
+            <w:tcMar>
+              <w:top w:type="dxa" w:w="60"/>
+              <w:left w:type="dxa" w:w="100"/>
+              <w:bottom w:type="dxa" w:w="60"/>
+              <w:right w:type="dxa" w:w="100"/>
+            </w:tcMar>
+          </w:tcPr>
+          <w:p>
+            <w:pPr>
+              <w:jc w:val="center"/>
+            </w:pPr>
+            <w:r>
+              <w:rPr>
+                <w:rFonts w:ascii="Arial" w:cs="Arial" w:eastAsia="Arial" w:hAnsi="Arial"/>
+                <w:b w:val="false"/>
+                <w:bCs w:val="false"/>
+                <w:i w:val="false"/>
+                <w:iCs w:val="false"/>
+                <w:sz w:val="20"/>
+                <w:szCs w:val="20"/>
+              </w:rPr>
+              <w:t xml:space="preserve">2</w:t>
+            </w:r>
+          </w:p>
+        </w:tc>
+      </w:tr>
+      <w:tr>
+        <w:tc>
+          <w:tcPr>
+            <w:tcW w:type="dxa" w:w="2400"/>
+            <w:tcBorders>
+              <w:top w:val="single" w:color="AAAAAA" w:sz="1"/>
+              <w:left w:val="single" w:color="AAAAAA" w:sz="1"/>
+              <w:bottom w:val="single" w:color="AAAAAA" w:sz="1"/>
+              <w:right w:val="single" w:color="AAAAAA" w:sz="1"/>
+            </w:tcBorders>
+            <w:shd w:fill="F2F7FB" w:val="clear"/>
+            <w:tcMar>
+              <w:top w:type="dxa" w:w="60"/>
+              <w:left w:type="dxa" w:w="100"/>
+              <w:bottom w:type="dxa" w:w="60"/>
+              <w:right w:type="dxa" w:w="100"/>
+            </w:tcMar>
+          </w:tcPr>
+          <w:p>
+            <w:r>
+              <w:rPr>
+                <w:rFonts w:ascii="Arial" w:cs="Arial" w:eastAsia="Arial" w:hAnsi="Arial"/>
+                <w:b/>
+                <w:bCs/>
+                <w:i w:val="false"/>
+                <w:iCs w:val="false"/>
+                <w:sz w:val="20"/>
+                <w:szCs w:val="20"/>
+              </w:rPr>
+              <w:t xml:space="preserve">Survey Response †</w:t>
+            </w:r>
+          </w:p>
+        </w:tc>
+        <w:tc>
+          <w:tcPr>
+            <w:tcW w:type="dxa" w:w="1240"/>
+            <w:tcBorders>
+              <w:top w:val="single" w:color="AAAAAA" w:sz="1"/>
+              <w:left w:val="single" w:color="AAAAAA" w:sz="1"/>
+              <w:bottom w:val="single" w:color="AAAAAA" w:sz="1"/>
+              <w:right w:val="single" w:color="AAAAAA" w:sz="1"/>
+            </w:tcBorders>
+            <w:shd w:fill="F2F7FB" w:val="clear"/>
+            <w:tcMar>
+              <w:top w:type="dxa" w:w="60"/>
+              <w:left w:type="dxa" w:w="100"/>
+              <w:bottom w:type="dxa" w:w="60"/>
+              <w:right w:type="dxa" w:w="100"/>
+            </w:tcMar>
+          </w:tcPr>
+          <w:p>
+            <w:pPr>
+              <w:jc w:val="center"/>
+            </w:pPr>
+            <w:r>
+              <w:rPr>
+                <w:rFonts w:ascii="Arial" w:cs="Arial" w:eastAsia="Arial" w:hAnsi="Arial"/>
+                <w:b w:val="false"/>
+                <w:bCs w:val="false"/>
+                <w:i w:val="false"/>
+                <w:iCs w:val="false"/>
+                <w:sz w:val="20"/>
+                <w:szCs w:val="20"/>
+              </w:rPr>
+              <w:t xml:space="preserve">✓</w:t>
+            </w:r>
+          </w:p>
+        </w:tc>
+        <w:tc>
+          <w:tcPr>
+            <w:tcW w:type="dxa" w:w="1240"/>
+            <w:tcBorders>
+              <w:top w:val="single" w:color="AAAAAA" w:sz="1"/>
+              <w:left w:val="single" w:color="AAAAAA" w:sz="1"/>
+              <w:bottom w:val="single" w:color="AAAAAA" w:sz="1"/>
+              <w:right w:val="single" w:color="AAAAAA" w:sz="1"/>
+            </w:tcBorders>
+            <w:shd w:fill="F2F7FB" w:val="clear"/>
+            <w:tcMar>
+              <w:top w:type="dxa" w:w="60"/>
+              <w:left w:type="dxa" w:w="100"/>
+              <w:bottom w:type="dxa" w:w="60"/>
+              <w:right w:type="dxa" w:w="100"/>
+            </w:tcMar>
+          </w:tcPr>
+          <w:p>
+            <w:pPr>
+              <w:jc w:val="center"/>
+            </w:pPr>
+            <w:r>
+              <w:rPr>
+                <w:rFonts w:ascii="Arial" w:cs="Arial" w:eastAsia="Arial" w:hAnsi="Arial"/>
+                <w:b w:val="false"/>
+                <w:bCs w:val="false"/>
+                <w:i w:val="false"/>
+                <w:iCs w:val="false"/>
+                <w:sz w:val="20"/>
+                <w:szCs w:val="20"/>
+              </w:rPr>
+              <w:t xml:space="preserve"/>
+            </w:r>
+          </w:p>
+        </w:tc>
+        <w:tc>
+          <w:tcPr>
+            <w:tcW w:type="dxa" w:w="1240"/>
+            <w:tcBorders>
+              <w:top w:val="single" w:color="AAAAAA" w:sz="1"/>
+              <w:left w:val="single" w:color="AAAAAA" w:sz="1"/>
+              <w:bottom w:val="single" w:color="AAAAAA" w:sz="1"/>
+              <w:right w:val="single" w:color="AAAAAA" w:sz="1"/>
+            </w:tcBorders>
+            <w:shd w:fill="F2F7FB" w:val="clear"/>
+            <w:tcMar>
+              <w:top w:type="dxa" w:w="60"/>
+              <w:left w:type="dxa" w:w="100"/>
+              <w:bottom w:type="dxa" w:w="60"/>
+              <w:right w:type="dxa" w:w="100"/>
+            </w:tcMar>
+          </w:tcPr>
+          <w:p>
+            <w:pPr>
+              <w:jc w:val="center"/>
+            </w:pPr>
+            <w:r>
+              <w:rPr>
+                <w:rFonts w:ascii="Arial" w:cs="Arial" w:eastAsia="Arial" w:hAnsi="Arial"/>
+                <w:b w:val="false"/>
+                <w:bCs w:val="false"/>
+                <w:i w:val="false"/>
+                <w:iCs w:val="false"/>
+                <w:sz w:val="20"/>
+                <w:szCs w:val="20"/>
+              </w:rPr>
+              <w:t xml:space="preserve">✓</w:t>
+            </w:r>
+          </w:p>
+        </w:tc>
+        <w:tc>
+          <w:tcPr>
+            <w:tcW w:type="dxa" w:w="1240"/>
+            <w:tcBorders>
+              <w:top w:val="single" w:color="AAAAAA" w:sz="1"/>
+              <w:left w:val="single" w:color="AAAAAA" w:sz="1"/>
+              <w:bottom w:val="single" w:color="AAAAAA" w:sz="1"/>
+              <w:right w:val="single" w:color="AAAAAA" w:sz="1"/>
+            </w:tcBorders>
+            <w:shd w:fill="F2F7FB" w:val="clear"/>
+            <w:tcMar>
+              <w:top w:type="dxa" w:w="60"/>
+              <w:left w:type="dxa" w:w="100"/>
+              <w:bottom w:type="dxa" w:w="60"/>
+              <w:right w:type="dxa" w:w="100"/>
+            </w:tcMar>
+          </w:tcPr>
+          <w:p>
+            <w:pPr>
+              <w:jc w:val="center"/>
+            </w:pPr>
+            <w:r>
+              <w:rPr>
+                <w:rFonts w:ascii="Arial" w:cs="Arial" w:eastAsia="Arial" w:hAnsi="Arial"/>
+                <w:b w:val="false"/>
+                <w:bCs w:val="false"/>
+                <w:i w:val="false"/>
+                <w:iCs w:val="false"/>
+                <w:sz w:val="20"/>
+                <w:szCs w:val="20"/>
+              </w:rPr>
+              <w:t xml:space="preserve"/>
+            </w:r>
+          </w:p>
+        </w:tc>
+        <w:tc>
+          <w:tcPr>
+            <w:tcW w:type="dxa" w:w="2000"/>
+            <w:tcBorders>
+              <w:top w:val="single" w:color="AAAAAA" w:sz="1"/>
+              <w:left w:val="single" w:color="AAAAAA" w:sz="1"/>
+              <w:bottom w:val="single" w:color="AAAAAA" w:sz="1"/>
+              <w:right w:val="single" w:color="AAAAAA" w:sz="1"/>
+            </w:tcBorders>
+            <w:shd w:fill="F2F7FB" w:val="clear"/>
+            <w:tcMar>
+              <w:top w:type="dxa" w:w="60"/>
+              <w:left w:type="dxa" w:w="100"/>
+              <w:bottom w:type="dxa" w:w="60"/>
+              <w:right w:type="dxa" w:w="100"/>
+            </w:tcMar>
+          </w:tcPr>
+          <w:p>
+            <w:pPr>
+              <w:jc w:val="center"/>
+            </w:pPr>
+            <w:r>
+              <w:rPr>
+                <w:rFonts w:ascii="Arial" w:cs="Arial" w:eastAsia="Arial" w:hAnsi="Arial"/>
+                <w:b w:val="false"/>
+                <w:bCs w:val="false"/>
+                <w:i w:val="false"/>
+                <w:iCs w:val="false"/>
+                <w:sz w:val="20"/>
+                <w:szCs w:val="20"/>
+              </w:rPr>
+              <w:t xml:space="preserve">2</w:t>
+            </w:r>
+          </w:p>
+        </w:tc>
+      </w:tr>
     </w:tbl>
     <w:p>
       <w:pPr>
@@ -11569,6 +12854,35 @@
           <w:szCs w:val="22"/>
         </w:rPr>
         <w:t xml:space="preserve">MR, CR, and FU domains have summary-level data from the Master PRD only. Process documents for these domains have not yet been produced. The cross-domain matrix will be updated as those domains are defined.</w:t>
+      </w:r>
+    </w:p>
+    <w:p>
+      <w:pPr>
+        <w:spacing w:after="120"/>
+      </w:pPr>
+      <w:r>
+        <w:rPr>
+          <w:rFonts w:ascii="Arial" w:cs="Arial" w:eastAsia="Arial" w:hAnsi="Arial"/>
+          <w:b/>
+          <w:bCs/>
+          <w:i w:val="false"/>
+          <w:iCs w:val="false"/>
+          <w:sz w:val="22"/>
+          <w:szCs w:val="22"/>
+        </w:rPr>
+        <w:t xml:space="preserve">† </w:t>
+      </w:r>
+      <w:r>
+        <w:rPr>
+          <w:rFonts w:ascii="Arial" w:cs="Arial" w:eastAsia="Arial" w:hAnsi="Arial"/>
+          <w:b w:val="false"/>
+          <w:bCs w:val="false"/>
+          <w:i w:val="false"/>
+          <w:iCs w:val="false"/>
+          <w:sz w:val="22"/>
+          <w:szCs w:val="22"/>
+        </w:rPr>
+        <w:t xml:space="preserve">Cross-Domain Service entities. Domain participation reflects the services that consume them as defined in the Master PRD. Native/Custom and Entity Type are TBD pending Entity PRD completion.</w:t>
       </w:r>
     </w:p>
     <w:p>
@@ -12703,6 +14017,40 @@
           <w:szCs w:val="22"/>
         </w:rPr>
         <w:t xml:space="preserve"> — Partnership Agreement, Event, Event Registration, Contribution, and Fundraising Campaign. These entities belong to the CR and FU domains where process documents have not yet been produced. Entity PRDs should document what is known from the Master PRD and flag incomplete domains.</w:t>
+      </w:r>
+    </w:p>
+    <w:p>
+      <w:pPr>
+        <w:pStyle w:val="ListParagraph"/>
+        <w:numPr>
+          <w:ilvl w:val="0"/>
+          <w:numId w:val="4"/>
+        </w:numPr>
+        <w:spacing w:after="120"/>
+      </w:pPr>
+      <w:r>
+        <w:rPr>
+          <w:rFonts w:ascii="Arial" w:cs="Arial" w:eastAsia="Arial" w:hAnsi="Arial"/>
+          <w:b/>
+          <w:bCs/>
+          <w:i w:val="false"/>
+          <w:iCs w:val="false"/>
+          <w:sz w:val="22"/>
+          <w:szCs w:val="22"/>
+        </w:rPr>
+        <w:t xml:space="preserve">6. Cross-Domain Service entities</w:t>
+      </w:r>
+      <w:r>
+        <w:rPr>
+          <w:rFonts w:ascii="Arial" w:cs="Arial" w:eastAsia="Arial" w:hAnsi="Arial"/>
+          <w:b w:val="false"/>
+          <w:bCs w:val="false"/>
+          <w:i w:val="false"/>
+          <w:iCs w:val="false"/>
+          <w:sz w:val="22"/>
+          <w:szCs w:val="22"/>
+        </w:rPr>
+        <w:t xml:space="preserve"> — Note (Notes Service), Survey, and Survey Response (Survey Service). These entities are owned by Cross-Domain Services identified in Master PRD v2.1. Native/Custom and Entity Type are TBD. Entity PRDs should be produced after service process definition establishes full requirements.</w:t>
       </w:r>
     </w:p>
     <w:p>

</xml_diff>

<commit_message>
Entity Inventory v1.2: add Dues entity, update counts (13 entities, 25 concepts), remove MR asterisk
</commit_message>
<xml_diff>
--- a/PRDs/CBM-Entity-Inventory.docx
+++ b/PRDs/CBM-Entity-Inventory.docx
@@ -309,7 +309,7 @@
                 <w:sz w:val="20"/>
                 <w:szCs w:val="20"/>
               </w:rPr>
-              <w:t xml:space="preserve">1.1</w:t>
+              <w:t xml:space="preserve">1.2</w:t>
             </w:r>
           </w:p>
         </w:tc>
@@ -439,7 +439,7 @@
                 <w:sz w:val="20"/>
                 <w:szCs w:val="20"/>
               </w:rPr>
-              <w:t xml:space="preserve">04-04-26 21:45</w:t>
+              <w:t xml:space="preserve">04-05-26 22:15</w:t>
             </w:r>
           </w:p>
         </w:tc>
@@ -594,7 +594,7 @@
           <w:sz w:val="22"/>
           <w:szCs w:val="22"/>
         </w:rPr>
-        <w:t xml:space="preserve">12 (2 native, 7 custom, 3 TBD)</w:t>
+        <w:t xml:space="preserve">13 (2 native, 8 custom, 3 TBD)</w:t>
       </w:r>
     </w:p>
     <w:p>
@@ -623,7 +623,7 @@
           <w:sz w:val="22"/>
           <w:szCs w:val="22"/>
         </w:rPr>
-        <w:t xml:space="preserve">24</w:t>
+        <w:t xml:space="preserve">25</w:t>
       </w:r>
     </w:p>
     <w:p>
@@ -652,7 +652,7 @@
           <w:sz w:val="22"/>
           <w:szCs w:val="22"/>
         </w:rPr>
-        <w:t xml:space="preserve">Master PRD v2.1 (includes Cross-Domain Services); Mentoring Domain PRD v1.0 (MN-INTAKE v2.1, MN-MATCH v2.1, MN-ENGAGE v2.3, MN-INACTIVE v1.2, MN-CLOSE v1.1). Mentor Recruitment, Client Recruiting, and Fundraising domains are represented at summary level from the Master PRD only. Cross-Domain Service entities (Note, Survey, Survey Response) are at inventory level only — full requirements deferred to service process definition and Entity PRDs.</w:t>
+        <w:t xml:space="preserve">Master PRD v2.1 (includes Cross-Domain Services); Mentoring Domain PRD v1.0 (MN-INTAKE v2.1, MN-MATCH v2.1, MN-ENGAGE v2.3, MN-INACTIVE v1.2, MN-CLOSE v1.1). Mentor Recruitment Domain PRD v1.0 (MR-RECRUIT v1.0, MR-APPLY v1.0, MR-ONBOARD v1.0, MR-MANAGE v1.0, MR-DEPART v1.0). Client Recruiting and Fundraising domains are represented at summary level from the Master PRD only. Cross-Domain Service entities (Note, Survey, Survey Response) are at inventory level only — full requirements deferred to service process definition and Entity PRDs.</w:t>
       </w:r>
     </w:p>
     <w:p>
@@ -3616,6 +3616,225 @@
                 <w:szCs w:val="16"/>
               </w:rPr>
               <w:t xml:space="preserve">MN</w:t>
+            </w:r>
+          </w:p>
+        </w:tc>
+      </w:tr>
+      <w:tr>
+        <w:tc>
+          <w:tcPr>
+            <w:tcW w:type="dxa" w:w="1700"/>
+            <w:tcBorders>
+              <w:top w:val="single" w:color="AAAAAA" w:sz="1"/>
+              <w:left w:val="single" w:color="AAAAAA" w:sz="1"/>
+              <w:bottom w:val="single" w:color="AAAAAA" w:sz="1"/>
+              <w:right w:val="single" w:color="AAAAAA" w:sz="1"/>
+            </w:tcBorders>
+            <w:tcMar>
+              <w:top w:type="dxa" w:w="60"/>
+              <w:left w:type="dxa" w:w="100"/>
+              <w:bottom w:type="dxa" w:w="60"/>
+              <w:right w:type="dxa" w:w="100"/>
+            </w:tcMar>
+          </w:tcPr>
+          <w:p>
+            <w:r>
+              <w:rPr>
+                <w:rFonts w:ascii="Arial" w:cs="Arial" w:eastAsia="Arial" w:hAnsi="Arial"/>
+                <w:b w:val="false"/>
+                <w:bCs w:val="false"/>
+                <w:i w:val="false"/>
+                <w:iCs w:val="false"/>
+                <w:sz w:val="16"/>
+                <w:szCs w:val="16"/>
+              </w:rPr>
+              <w:t xml:space="preserve">Dues</w:t>
+            </w:r>
+          </w:p>
+        </w:tc>
+        <w:tc>
+          <w:tcPr>
+            <w:tcW w:type="dxa" w:w="1200"/>
+            <w:tcBorders>
+              <w:top w:val="single" w:color="AAAAAA" w:sz="1"/>
+              <w:left w:val="single" w:color="AAAAAA" w:sz="1"/>
+              <w:bottom w:val="single" w:color="AAAAAA" w:sz="1"/>
+              <w:right w:val="single" w:color="AAAAAA" w:sz="1"/>
+            </w:tcBorders>
+            <w:tcMar>
+              <w:top w:type="dxa" w:w="60"/>
+              <w:left w:type="dxa" w:w="100"/>
+              <w:bottom w:type="dxa" w:w="60"/>
+              <w:right w:type="dxa" w:w="100"/>
+            </w:tcMar>
+          </w:tcPr>
+          <w:p>
+            <w:r>
+              <w:rPr>
+                <w:rFonts w:ascii="Arial" w:cs="Arial" w:eastAsia="Arial" w:hAnsi="Arial"/>
+                <w:b w:val="false"/>
+                <w:bCs w:val="false"/>
+                <w:i w:val="false"/>
+                <w:iCs w:val="false"/>
+                <w:sz w:val="16"/>
+                <w:szCs w:val="16"/>
+              </w:rPr>
+              <w:t xml:space="preserve">Dues</w:t>
+            </w:r>
+          </w:p>
+        </w:tc>
+        <w:tc>
+          <w:tcPr>
+            <w:tcW w:type="dxa" w:w="900"/>
+            <w:tcBorders>
+              <w:top w:val="single" w:color="AAAAAA" w:sz="1"/>
+              <w:left w:val="single" w:color="AAAAAA" w:sz="1"/>
+              <w:bottom w:val="single" w:color="AAAAAA" w:sz="1"/>
+              <w:right w:val="single" w:color="AAAAAA" w:sz="1"/>
+            </w:tcBorders>
+            <w:tcMar>
+              <w:top w:type="dxa" w:w="60"/>
+              <w:left w:type="dxa" w:w="100"/>
+              <w:bottom w:type="dxa" w:w="60"/>
+              <w:right w:type="dxa" w:w="100"/>
+            </w:tcMar>
+          </w:tcPr>
+          <w:p>
+            <w:r>
+              <w:rPr>
+                <w:rFonts w:ascii="Arial" w:cs="Arial" w:eastAsia="Arial" w:hAnsi="Arial"/>
+                <w:b w:val="false"/>
+                <w:bCs w:val="false"/>
+                <w:i w:val="false"/>
+                <w:iCs w:val="false"/>
+                <w:sz w:val="16"/>
+                <w:szCs w:val="16"/>
+              </w:rPr>
+              <w:t xml:space="preserve">Custom</w:t>
+            </w:r>
+          </w:p>
+        </w:tc>
+        <w:tc>
+          <w:tcPr>
+            <w:tcW w:type="dxa" w:w="900"/>
+            <w:tcBorders>
+              <w:top w:val="single" w:color="AAAAAA" w:sz="1"/>
+              <w:left w:val="single" w:color="AAAAAA" w:sz="1"/>
+              <w:bottom w:val="single" w:color="AAAAAA" w:sz="1"/>
+              <w:right w:val="single" w:color="AAAAAA" w:sz="1"/>
+            </w:tcBorders>
+            <w:tcMar>
+              <w:top w:type="dxa" w:w="60"/>
+              <w:left w:type="dxa" w:w="100"/>
+              <w:bottom w:type="dxa" w:w="60"/>
+              <w:right w:type="dxa" w:w="100"/>
+            </w:tcMar>
+          </w:tcPr>
+          <w:p>
+            <w:r>
+              <w:rPr>
+                <w:rFonts w:ascii="Arial" w:cs="Arial" w:eastAsia="Arial" w:hAnsi="Arial"/>
+                <w:b w:val="false"/>
+                <w:bCs w:val="false"/>
+                <w:i w:val="false"/>
+                <w:iCs w:val="false"/>
+                <w:sz w:val="16"/>
+                <w:szCs w:val="16"/>
+              </w:rPr>
+              <w:t xml:space="preserve">Base</w:t>
+            </w:r>
+          </w:p>
+        </w:tc>
+        <w:tc>
+          <w:tcPr>
+            <w:tcW w:type="dxa" w:w="1200"/>
+            <w:tcBorders>
+              <w:top w:val="single" w:color="AAAAAA" w:sz="1"/>
+              <w:left w:val="single" w:color="AAAAAA" w:sz="1"/>
+              <w:bottom w:val="single" w:color="AAAAAA" w:sz="1"/>
+              <w:right w:val="single" w:color="AAAAAA" w:sz="1"/>
+            </w:tcBorders>
+            <w:tcMar>
+              <w:top w:type="dxa" w:w="60"/>
+              <w:left w:type="dxa" w:w="100"/>
+              <w:bottom w:type="dxa" w:w="60"/>
+              <w:right w:type="dxa" w:w="100"/>
+            </w:tcMar>
+          </w:tcPr>
+          <w:p>
+            <w:r>
+              <w:rPr>
+                <w:rFonts w:ascii="Arial" w:cs="Arial" w:eastAsia="Arial" w:hAnsi="Arial"/>
+                <w:b w:val="false"/>
+                <w:bCs w:val="false"/>
+                <w:i w:val="false"/>
+                <w:iCs w:val="false"/>
+                <w:sz w:val="16"/>
+                <w:szCs w:val="16"/>
+              </w:rPr>
+              <w:t xml:space="preserve">—</w:t>
+            </w:r>
+          </w:p>
+        </w:tc>
+        <w:tc>
+          <w:tcPr>
+            <w:tcW w:type="dxa" w:w="1300"/>
+            <w:tcBorders>
+              <w:top w:val="single" w:color="AAAAAA" w:sz="1"/>
+              <w:left w:val="single" w:color="AAAAAA" w:sz="1"/>
+              <w:bottom w:val="single" w:color="AAAAAA" w:sz="1"/>
+              <w:right w:val="single" w:color="AAAAAA" w:sz="1"/>
+            </w:tcBorders>
+            <w:tcMar>
+              <w:top w:type="dxa" w:w="60"/>
+              <w:left w:type="dxa" w:w="100"/>
+              <w:bottom w:type="dxa" w:w="60"/>
+              <w:right w:type="dxa" w:w="100"/>
+            </w:tcMar>
+          </w:tcPr>
+          <w:p>
+            <w:r>
+              <w:rPr>
+                <w:rFonts w:ascii="Arial" w:cs="Arial" w:eastAsia="Arial" w:hAnsi="Arial"/>
+                <w:b w:val="false"/>
+                <w:bCs w:val="false"/>
+                <w:i w:val="false"/>
+                <w:iCs w:val="false"/>
+                <w:sz w:val="16"/>
+                <w:szCs w:val="16"/>
+              </w:rPr>
+              <w:t xml:space="preserve">—</w:t>
+            </w:r>
+          </w:p>
+        </w:tc>
+        <w:tc>
+          <w:tcPr>
+            <w:tcW w:type="dxa" w:w="2160"/>
+            <w:tcBorders>
+              <w:top w:val="single" w:color="AAAAAA" w:sz="1"/>
+              <w:left w:val="single" w:color="AAAAAA" w:sz="1"/>
+              <w:bottom w:val="single" w:color="AAAAAA" w:sz="1"/>
+              <w:right w:val="single" w:color="AAAAAA" w:sz="1"/>
+            </w:tcBorders>
+            <w:tcMar>
+              <w:top w:type="dxa" w:w="60"/>
+              <w:left w:type="dxa" w:w="100"/>
+              <w:bottom w:type="dxa" w:w="60"/>
+              <w:right w:type="dxa" w:w="100"/>
+            </w:tcMar>
+          </w:tcPr>
+          <w:p>
+            <w:r>
+              <w:rPr>
+                <w:rFonts w:ascii="Arial" w:cs="Arial" w:eastAsia="Arial" w:hAnsi="Arial"/>
+                <w:b w:val="false"/>
+                <w:bCs w:val="false"/>
+                <w:i w:val="false"/>
+                <w:iCs w:val="false"/>
+                <w:sz w:val="16"/>
+                <w:szCs w:val="16"/>
+              </w:rPr>
+              <w:t xml:space="preserve">MR</w:t>
             </w:r>
           </w:p>
         </w:tc>
@@ -7972,7 +8191,429 @@
           <w:sz w:val="28"/>
           <w:szCs w:val="28"/>
         </w:rPr>
-        <w:t xml:space="preserve">4.3 Partnership Agreement</w:t>
+        <w:t xml:space="preserve">4.3 Dues</w:t>
+      </w:r>
+    </w:p>
+    <w:tbl>
+      <w:tblPr>
+        <w:tblW w:type="dxa" w:w="9360"/>
+        <w:tblBorders>
+          <w:top w:val="single" w:color="auto" w:sz="4"/>
+          <w:left w:val="single" w:color="auto" w:sz="4"/>
+          <w:bottom w:val="single" w:color="auto" w:sz="4"/>
+          <w:right w:val="single" w:color="auto" w:sz="4"/>
+          <w:insideH w:val="single" w:color="auto" w:sz="4"/>
+          <w:insideV w:val="single" w:color="auto" w:sz="4"/>
+        </w:tblBorders>
+      </w:tblPr>
+      <w:tblGrid>
+        <w:gridCol w:w="2400"/>
+        <w:gridCol w:w="6960"/>
+      </w:tblGrid>
+      <w:tr>
+        <w:tc>
+          <w:tcPr>
+            <w:tcW w:type="dxa" w:w="2400"/>
+            <w:tcBorders>
+              <w:top w:val="single" w:color="AAAAAA" w:sz="1"/>
+              <w:left w:val="single" w:color="AAAAAA" w:sz="1"/>
+              <w:bottom w:val="single" w:color="AAAAAA" w:sz="1"/>
+              <w:right w:val="single" w:color="AAAAAA" w:sz="1"/>
+            </w:tcBorders>
+            <w:shd w:fill="F2F7FB" w:val="clear"/>
+            <w:tcMar>
+              <w:top w:type="dxa" w:w="60"/>
+              <w:left w:type="dxa" w:w="100"/>
+              <w:bottom w:type="dxa" w:w="60"/>
+              <w:right w:type="dxa" w:w="100"/>
+            </w:tcMar>
+          </w:tcPr>
+          <w:p>
+            <w:r>
+              <w:rPr>
+                <w:rFonts w:ascii="Arial" w:cs="Arial" w:eastAsia="Arial" w:hAnsi="Arial"/>
+                <w:b/>
+                <w:bCs/>
+                <w:i w:val="false"/>
+                <w:iCs w:val="false"/>
+                <w:sz w:val="20"/>
+                <w:szCs w:val="20"/>
+              </w:rPr>
+              <w:t xml:space="preserve">Entity Type</w:t>
+            </w:r>
+          </w:p>
+        </w:tc>
+        <w:tc>
+          <w:tcPr>
+            <w:tcW w:type="dxa" w:w="6960"/>
+            <w:tcBorders>
+              <w:top w:val="single" w:color="AAAAAA" w:sz="1"/>
+              <w:left w:val="single" w:color="AAAAAA" w:sz="1"/>
+              <w:bottom w:val="single" w:color="AAAAAA" w:sz="1"/>
+              <w:right w:val="single" w:color="AAAAAA" w:sz="1"/>
+            </w:tcBorders>
+            <w:tcMar>
+              <w:top w:type="dxa" w:w="60"/>
+              <w:left w:type="dxa" w:w="100"/>
+              <w:bottom w:type="dxa" w:w="60"/>
+              <w:right w:type="dxa" w:w="100"/>
+            </w:tcMar>
+          </w:tcPr>
+          <w:p>
+            <w:r>
+              <w:rPr>
+                <w:rFonts w:ascii="Arial" w:cs="Arial" w:eastAsia="Arial" w:hAnsi="Arial"/>
+                <w:b w:val="false"/>
+                <w:bCs w:val="false"/>
+                <w:i w:val="false"/>
+                <w:iCs w:val="false"/>
+                <w:sz w:val="20"/>
+                <w:szCs w:val="20"/>
+              </w:rPr>
+              <w:t xml:space="preserve">Base</w:t>
+            </w:r>
+          </w:p>
+        </w:tc>
+      </w:tr>
+      <w:tr>
+        <w:tc>
+          <w:tcPr>
+            <w:tcW w:type="dxa" w:w="2400"/>
+            <w:tcBorders>
+              <w:top w:val="single" w:color="AAAAAA" w:sz="1"/>
+              <w:left w:val="single" w:color="AAAAAA" w:sz="1"/>
+              <w:bottom w:val="single" w:color="AAAAAA" w:sz="1"/>
+              <w:right w:val="single" w:color="AAAAAA" w:sz="1"/>
+            </w:tcBorders>
+            <w:tcMar>
+              <w:top w:type="dxa" w:w="60"/>
+              <w:left w:type="dxa" w:w="100"/>
+              <w:bottom w:type="dxa" w:w="60"/>
+              <w:right w:type="dxa" w:w="100"/>
+            </w:tcMar>
+          </w:tcPr>
+          <w:p>
+            <w:r>
+              <w:rPr>
+                <w:rFonts w:ascii="Arial" w:cs="Arial" w:eastAsia="Arial" w:hAnsi="Arial"/>
+                <w:b/>
+                <w:bCs/>
+                <w:i w:val="false"/>
+                <w:iCs w:val="false"/>
+                <w:sz w:val="20"/>
+                <w:szCs w:val="20"/>
+              </w:rPr>
+              <w:t xml:space="preserve">Display Label (Singular)</w:t>
+            </w:r>
+          </w:p>
+        </w:tc>
+        <w:tc>
+          <w:tcPr>
+            <w:tcW w:type="dxa" w:w="6960"/>
+            <w:tcBorders>
+              <w:top w:val="single" w:color="AAAAAA" w:sz="1"/>
+              <w:left w:val="single" w:color="AAAAAA" w:sz="1"/>
+              <w:bottom w:val="single" w:color="AAAAAA" w:sz="1"/>
+              <w:right w:val="single" w:color="AAAAAA" w:sz="1"/>
+            </w:tcBorders>
+            <w:tcMar>
+              <w:top w:type="dxa" w:w="60"/>
+              <w:left w:type="dxa" w:w="100"/>
+              <w:bottom w:type="dxa" w:w="60"/>
+              <w:right w:type="dxa" w:w="100"/>
+            </w:tcMar>
+          </w:tcPr>
+          <w:p>
+            <w:r>
+              <w:rPr>
+                <w:rFonts w:ascii="Arial" w:cs="Arial" w:eastAsia="Arial" w:hAnsi="Arial"/>
+                <w:b w:val="false"/>
+                <w:bCs w:val="false"/>
+                <w:i w:val="false"/>
+                <w:iCs w:val="false"/>
+                <w:sz w:val="20"/>
+                <w:szCs w:val="20"/>
+              </w:rPr>
+              <w:t xml:space="preserve">Dues</w:t>
+            </w:r>
+          </w:p>
+        </w:tc>
+      </w:tr>
+      <w:tr>
+        <w:tc>
+          <w:tcPr>
+            <w:tcW w:type="dxa" w:w="2400"/>
+            <w:tcBorders>
+              <w:top w:val="single" w:color="AAAAAA" w:sz="1"/>
+              <w:left w:val="single" w:color="AAAAAA" w:sz="1"/>
+              <w:bottom w:val="single" w:color="AAAAAA" w:sz="1"/>
+              <w:right w:val="single" w:color="AAAAAA" w:sz="1"/>
+            </w:tcBorders>
+            <w:shd w:fill="F2F7FB" w:val="clear"/>
+            <w:tcMar>
+              <w:top w:type="dxa" w:w="60"/>
+              <w:left w:type="dxa" w:w="100"/>
+              <w:bottom w:type="dxa" w:w="60"/>
+              <w:right w:type="dxa" w:w="100"/>
+            </w:tcMar>
+          </w:tcPr>
+          <w:p>
+            <w:r>
+              <w:rPr>
+                <w:rFonts w:ascii="Arial" w:cs="Arial" w:eastAsia="Arial" w:hAnsi="Arial"/>
+                <w:b/>
+                <w:bCs/>
+                <w:i w:val="false"/>
+                <w:iCs w:val="false"/>
+                <w:sz w:val="20"/>
+                <w:szCs w:val="20"/>
+              </w:rPr>
+              <w:t xml:space="preserve">Display Label (Plural)</w:t>
+            </w:r>
+          </w:p>
+        </w:tc>
+        <w:tc>
+          <w:tcPr>
+            <w:tcW w:type="dxa" w:w="6960"/>
+            <w:tcBorders>
+              <w:top w:val="single" w:color="AAAAAA" w:sz="1"/>
+              <w:left w:val="single" w:color="AAAAAA" w:sz="1"/>
+              <w:bottom w:val="single" w:color="AAAAAA" w:sz="1"/>
+              <w:right w:val="single" w:color="AAAAAA" w:sz="1"/>
+            </w:tcBorders>
+            <w:tcMar>
+              <w:top w:type="dxa" w:w="60"/>
+              <w:left w:type="dxa" w:w="100"/>
+              <w:bottom w:type="dxa" w:w="60"/>
+              <w:right w:type="dxa" w:w="100"/>
+            </w:tcMar>
+          </w:tcPr>
+          <w:p>
+            <w:r>
+              <w:rPr>
+                <w:rFonts w:ascii="Arial" w:cs="Arial" w:eastAsia="Arial" w:hAnsi="Arial"/>
+                <w:b w:val="false"/>
+                <w:bCs w:val="false"/>
+                <w:i w:val="false"/>
+                <w:iCs w:val="false"/>
+                <w:sz w:val="20"/>
+                <w:szCs w:val="20"/>
+              </w:rPr>
+              <w:t xml:space="preserve">Dues</w:t>
+            </w:r>
+          </w:p>
+        </w:tc>
+      </w:tr>
+      <w:tr>
+        <w:tc>
+          <w:tcPr>
+            <w:tcW w:type="dxa" w:w="2400"/>
+            <w:tcBorders>
+              <w:top w:val="single" w:color="AAAAAA" w:sz="1"/>
+              <w:left w:val="single" w:color="AAAAAA" w:sz="1"/>
+              <w:bottom w:val="single" w:color="AAAAAA" w:sz="1"/>
+              <w:right w:val="single" w:color="AAAAAA" w:sz="1"/>
+            </w:tcBorders>
+            <w:tcMar>
+              <w:top w:type="dxa" w:w="60"/>
+              <w:left w:type="dxa" w:w="100"/>
+              <w:bottom w:type="dxa" w:w="60"/>
+              <w:right w:type="dxa" w:w="100"/>
+            </w:tcMar>
+          </w:tcPr>
+          <w:p>
+            <w:r>
+              <w:rPr>
+                <w:rFonts w:ascii="Arial" w:cs="Arial" w:eastAsia="Arial" w:hAnsi="Arial"/>
+                <w:b/>
+                <w:bCs/>
+                <w:i w:val="false"/>
+                <w:iCs w:val="false"/>
+                <w:sz w:val="20"/>
+                <w:szCs w:val="20"/>
+              </w:rPr>
+              <w:t xml:space="preserve">Owning Domain</w:t>
+            </w:r>
+          </w:p>
+        </w:tc>
+        <w:tc>
+          <w:tcPr>
+            <w:tcW w:type="dxa" w:w="6960"/>
+            <w:tcBorders>
+              <w:top w:val="single" w:color="AAAAAA" w:sz="1"/>
+              <w:left w:val="single" w:color="AAAAAA" w:sz="1"/>
+              <w:bottom w:val="single" w:color="AAAAAA" w:sz="1"/>
+              <w:right w:val="single" w:color="AAAAAA" w:sz="1"/>
+            </w:tcBorders>
+            <w:tcMar>
+              <w:top w:type="dxa" w:w="60"/>
+              <w:left w:type="dxa" w:w="100"/>
+              <w:bottom w:type="dxa" w:w="60"/>
+              <w:right w:type="dxa" w:w="100"/>
+            </w:tcMar>
+          </w:tcPr>
+          <w:p>
+            <w:r>
+              <w:rPr>
+                <w:rFonts w:ascii="Arial" w:cs="Arial" w:eastAsia="Arial" w:hAnsi="Arial"/>
+                <w:b w:val="false"/>
+                <w:bCs w:val="false"/>
+                <w:i w:val="false"/>
+                <w:iCs w:val="false"/>
+                <w:sz w:val="20"/>
+                <w:szCs w:val="20"/>
+              </w:rPr>
+              <w:t xml:space="preserve">Mentor Recruitment (MR)</w:t>
+            </w:r>
+          </w:p>
+        </w:tc>
+      </w:tr>
+      <w:tr>
+        <w:tc>
+          <w:tcPr>
+            <w:tcW w:type="dxa" w:w="2400"/>
+            <w:tcBorders>
+              <w:top w:val="single" w:color="AAAAAA" w:sz="1"/>
+              <w:left w:val="single" w:color="AAAAAA" w:sz="1"/>
+              <w:bottom w:val="single" w:color="AAAAAA" w:sz="1"/>
+              <w:right w:val="single" w:color="AAAAAA" w:sz="1"/>
+            </w:tcBorders>
+            <w:shd w:fill="F2F7FB" w:val="clear"/>
+            <w:tcMar>
+              <w:top w:type="dxa" w:w="60"/>
+              <w:left w:type="dxa" w:w="100"/>
+              <w:bottom w:type="dxa" w:w="60"/>
+              <w:right w:type="dxa" w:w="100"/>
+            </w:tcMar>
+          </w:tcPr>
+          <w:p>
+            <w:r>
+              <w:rPr>
+                <w:rFonts w:ascii="Arial" w:cs="Arial" w:eastAsia="Arial" w:hAnsi="Arial"/>
+                <w:b/>
+                <w:bCs/>
+                <w:i w:val="false"/>
+                <w:iCs w:val="false"/>
+                <w:sz w:val="20"/>
+                <w:szCs w:val="20"/>
+              </w:rPr>
+              <w:t xml:space="preserve">Activity Stream</w:t>
+            </w:r>
+          </w:p>
+        </w:tc>
+        <w:tc>
+          <w:tcPr>
+            <w:tcW w:type="dxa" w:w="6960"/>
+            <w:tcBorders>
+              <w:top w:val="single" w:color="AAAAAA" w:sz="1"/>
+              <w:left w:val="single" w:color="AAAAAA" w:sz="1"/>
+              <w:bottom w:val="single" w:color="AAAAAA" w:sz="1"/>
+              <w:right w:val="single" w:color="AAAAAA" w:sz="1"/>
+            </w:tcBorders>
+            <w:tcMar>
+              <w:top w:type="dxa" w:w="60"/>
+              <w:left w:type="dxa" w:w="100"/>
+              <w:bottom w:type="dxa" w:w="60"/>
+              <w:right w:type="dxa" w:w="100"/>
+            </w:tcMar>
+          </w:tcPr>
+          <w:p>
+            <w:r>
+              <w:rPr>
+                <w:rFonts w:ascii="Arial" w:cs="Arial" w:eastAsia="Arial" w:hAnsi="Arial"/>
+                <w:b w:val="false"/>
+                <w:bCs w:val="false"/>
+                <w:i w:val="false"/>
+                <w:iCs w:val="false"/>
+                <w:sz w:val="20"/>
+                <w:szCs w:val="20"/>
+              </w:rPr>
+              <w:t xml:space="preserve">No</w:t>
+            </w:r>
+          </w:p>
+        </w:tc>
+      </w:tr>
+    </w:tbl>
+    <w:p>
+      <w:pPr>
+        <w:spacing w:after="120"/>
+      </w:pPr>
+      <w:r>
+        <w:rPr>
+          <w:rFonts w:ascii="Arial" w:cs="Arial" w:eastAsia="Arial" w:hAnsi="Arial"/>
+          <w:b w:val="false"/>
+          <w:bCs w:val="false"/>
+          <w:i w:val="false"/>
+          <w:iCs w:val="false"/>
+          <w:sz w:val="22"/>
+          <w:szCs w:val="22"/>
+        </w:rPr>
+        <w:t xml:space="preserve"/>
+      </w:r>
+    </w:p>
+    <w:p>
+      <w:pPr>
+        <w:spacing w:after="120"/>
+      </w:pPr>
+      <w:r>
+        <w:rPr>
+          <w:rFonts w:ascii="Arial" w:cs="Arial" w:eastAsia="Arial" w:hAnsi="Arial"/>
+          <w:b w:val="false"/>
+          <w:bCs w:val="false"/>
+          <w:i w:val="false"/>
+          <w:iCs w:val="false"/>
+          <w:sz w:val="22"/>
+          <w:szCs w:val="22"/>
+        </w:rPr>
+        <w:t xml:space="preserve">One annual dues obligation for a single mentor. One record is created per mentor per billing year. Dues records provide a complete payment history independent of the summary duesStatus and duesPaymentDate fields on the mentor Contact record. Billing is based on the mentor’s activation anniversary.</w:t>
+      </w:r>
+    </w:p>
+    <w:p>
+      <w:pPr>
+        <w:spacing w:after="120"/>
+      </w:pPr>
+      <w:r>
+        <w:rPr>
+          <w:rFonts w:ascii="Arial" w:cs="Arial" w:eastAsia="Arial" w:hAnsi="Arial"/>
+          <w:b/>
+          <w:bCs/>
+          <w:i/>
+          <w:iCs/>
+          <w:sz w:val="22"/>
+          <w:szCs w:val="22"/>
+        </w:rPr>
+        <w:t xml:space="preserve">Type Rationale: </w:t>
+      </w:r>
+      <w:r>
+        <w:rPr>
+          <w:rFonts w:ascii="Arial" w:cs="Arial" w:eastAsia="Arial" w:hAnsi="Arial"/>
+          <w:b w:val="false"/>
+          <w:bCs w:val="false"/>
+          <w:i/>
+          <w:iCs/>
+          <w:sz w:val="22"/>
+          <w:szCs w:val="22"/>
+        </w:rPr>
+        <w:t xml:space="preserve">Base type chosen because Dues is a simple child record with no calendar/scheduling behavior, no person or company attributes, and no need for native Event fields.</w:t>
+      </w:r>
+    </w:p>
+    <w:p>
+      <w:pPr>
+        <w:pStyle w:val="Heading2"/>
+        <w:spacing w:after="120" w:before="240"/>
+      </w:pPr>
+      <w:r>
+        <w:rPr>
+          <w:rFonts w:ascii="Arial" w:cs="Arial" w:eastAsia="Arial" w:hAnsi="Arial"/>
+          <w:b/>
+          <w:bCs/>
+          <w:i w:val="false"/>
+          <w:iCs w:val="false"/>
+          <w:color w:val="1F3864"/>
+          <w:sz w:val="28"/>
+          <w:szCs w:val="28"/>
+        </w:rPr>
+        <w:t xml:space="preserve">4.4 Partnership Agreement</w:t>
       </w:r>
     </w:p>
     <w:tbl>
@@ -8396,7 +9037,7 @@
           <w:sz w:val="28"/>
           <w:szCs w:val="28"/>
         </w:rPr>
-        <w:t xml:space="preserve">4.4 Event</w:t>
+        <w:t xml:space="preserve">4.5 Event</w:t>
       </w:r>
     </w:p>
     <w:tbl>
@@ -8820,7 +9461,7 @@
           <w:sz w:val="28"/>
           <w:szCs w:val="28"/>
         </w:rPr>
-        <w:t xml:space="preserve">4.5 Event Registration</w:t>
+        <w:t xml:space="preserve">4.6 Event Registration</w:t>
       </w:r>
     </w:p>
     <w:tbl>
@@ -9244,7 +9885,7 @@
           <w:sz w:val="28"/>
           <w:szCs w:val="28"/>
         </w:rPr>
-        <w:t xml:space="preserve">4.6 Contribution</w:t>
+        <w:t xml:space="preserve">4.7 Contribution</w:t>
       </w:r>
     </w:p>
     <w:tbl>
@@ -9668,7 +10309,7 @@
           <w:sz w:val="28"/>
           <w:szCs w:val="28"/>
         </w:rPr>
-        <w:t xml:space="preserve">4.7 Fundraising Campaign</w:t>
+        <w:t xml:space="preserve">4.8 Fundraising Campaign</w:t>
       </w:r>
     </w:p>
     <w:tbl>
@@ -10233,7 +10874,7 @@
                 <w:sz w:val="20"/>
                 <w:szCs w:val="20"/>
               </w:rPr>
-              <w:t xml:space="preserve">MR *</w:t>
+              <w:t xml:space="preserve">MR</w:t>
             </w:r>
           </w:p>
         </w:tc>
@@ -11135,6 +11776,209 @@
               <w:right w:val="single" w:color="AAAAAA" w:sz="1"/>
             </w:tcBorders>
             <w:shd w:fill="F2F7FB" w:val="clear"/>
+            <w:tcMar>
+              <w:top w:type="dxa" w:w="60"/>
+              <w:left w:type="dxa" w:w="100"/>
+              <w:bottom w:type="dxa" w:w="60"/>
+              <w:right w:type="dxa" w:w="100"/>
+            </w:tcMar>
+          </w:tcPr>
+          <w:p>
+            <w:pPr>
+              <w:jc w:val="center"/>
+            </w:pPr>
+            <w:r>
+              <w:rPr>
+                <w:rFonts w:ascii="Arial" w:cs="Arial" w:eastAsia="Arial" w:hAnsi="Arial"/>
+                <w:b w:val="false"/>
+                <w:bCs w:val="false"/>
+                <w:i w:val="false"/>
+                <w:iCs w:val="false"/>
+                <w:sz w:val="20"/>
+                <w:szCs w:val="20"/>
+              </w:rPr>
+              <w:t xml:space="preserve">1</w:t>
+            </w:r>
+          </w:p>
+        </w:tc>
+      </w:tr>
+      <w:tr>
+        <w:tc>
+          <w:tcPr>
+            <w:tcW w:type="dxa" w:w="2400"/>
+            <w:tcBorders>
+              <w:top w:val="single" w:color="AAAAAA" w:sz="1"/>
+              <w:left w:val="single" w:color="AAAAAA" w:sz="1"/>
+              <w:bottom w:val="single" w:color="AAAAAA" w:sz="1"/>
+              <w:right w:val="single" w:color="AAAAAA" w:sz="1"/>
+            </w:tcBorders>
+            <w:tcMar>
+              <w:top w:type="dxa" w:w="60"/>
+              <w:left w:type="dxa" w:w="100"/>
+              <w:bottom w:type="dxa" w:w="60"/>
+              <w:right w:type="dxa" w:w="100"/>
+            </w:tcMar>
+          </w:tcPr>
+          <w:p>
+            <w:r>
+              <w:rPr>
+                <w:rFonts w:ascii="Arial" w:cs="Arial" w:eastAsia="Arial" w:hAnsi="Arial"/>
+                <w:b/>
+                <w:bCs/>
+                <w:i w:val="false"/>
+                <w:iCs w:val="false"/>
+                <w:sz w:val="20"/>
+                <w:szCs w:val="20"/>
+              </w:rPr>
+              <w:t xml:space="preserve">Dues</w:t>
+            </w:r>
+          </w:p>
+        </w:tc>
+        <w:tc>
+          <w:tcPr>
+            <w:tcW w:type="dxa" w:w="1240"/>
+            <w:tcBorders>
+              <w:top w:val="single" w:color="AAAAAA" w:sz="1"/>
+              <w:left w:val="single" w:color="AAAAAA" w:sz="1"/>
+              <w:bottom w:val="single" w:color="AAAAAA" w:sz="1"/>
+              <w:right w:val="single" w:color="AAAAAA" w:sz="1"/>
+            </w:tcBorders>
+            <w:tcMar>
+              <w:top w:type="dxa" w:w="60"/>
+              <w:left w:type="dxa" w:w="100"/>
+              <w:bottom w:type="dxa" w:w="60"/>
+              <w:right w:type="dxa" w:w="100"/>
+            </w:tcMar>
+          </w:tcPr>
+          <w:p>
+            <w:pPr>
+              <w:jc w:val="center"/>
+            </w:pPr>
+            <w:r>
+              <w:rPr>
+                <w:rFonts w:ascii="Arial" w:cs="Arial" w:eastAsia="Arial" w:hAnsi="Arial"/>
+                <w:b w:val="false"/>
+                <w:bCs w:val="false"/>
+                <w:i w:val="false"/>
+                <w:iCs w:val="false"/>
+                <w:sz w:val="20"/>
+                <w:szCs w:val="20"/>
+              </w:rPr>
+              <w:t xml:space="preserve"/>
+            </w:r>
+          </w:p>
+        </w:tc>
+        <w:tc>
+          <w:tcPr>
+            <w:tcW w:type="dxa" w:w="1240"/>
+            <w:tcBorders>
+              <w:top w:val="single" w:color="AAAAAA" w:sz="1"/>
+              <w:left w:val="single" w:color="AAAAAA" w:sz="1"/>
+              <w:bottom w:val="single" w:color="AAAAAA" w:sz="1"/>
+              <w:right w:val="single" w:color="AAAAAA" w:sz="1"/>
+            </w:tcBorders>
+            <w:tcMar>
+              <w:top w:type="dxa" w:w="60"/>
+              <w:left w:type="dxa" w:w="100"/>
+              <w:bottom w:type="dxa" w:w="60"/>
+              <w:right w:type="dxa" w:w="100"/>
+            </w:tcMar>
+          </w:tcPr>
+          <w:p>
+            <w:pPr>
+              <w:jc w:val="center"/>
+            </w:pPr>
+            <w:r>
+              <w:rPr>
+                <w:rFonts w:ascii="Arial" w:cs="Arial" w:eastAsia="Arial" w:hAnsi="Arial"/>
+                <w:b w:val="false"/>
+                <w:bCs w:val="false"/>
+                <w:i w:val="false"/>
+                <w:iCs w:val="false"/>
+                <w:sz w:val="20"/>
+                <w:szCs w:val="20"/>
+              </w:rPr>
+              <w:t xml:space="preserve">✓</w:t>
+            </w:r>
+          </w:p>
+        </w:tc>
+        <w:tc>
+          <w:tcPr>
+            <w:tcW w:type="dxa" w:w="1240"/>
+            <w:tcBorders>
+              <w:top w:val="single" w:color="AAAAAA" w:sz="1"/>
+              <w:left w:val="single" w:color="AAAAAA" w:sz="1"/>
+              <w:bottom w:val="single" w:color="AAAAAA" w:sz="1"/>
+              <w:right w:val="single" w:color="AAAAAA" w:sz="1"/>
+            </w:tcBorders>
+            <w:tcMar>
+              <w:top w:type="dxa" w:w="60"/>
+              <w:left w:type="dxa" w:w="100"/>
+              <w:bottom w:type="dxa" w:w="60"/>
+              <w:right w:type="dxa" w:w="100"/>
+            </w:tcMar>
+          </w:tcPr>
+          <w:p>
+            <w:pPr>
+              <w:jc w:val="center"/>
+            </w:pPr>
+            <w:r>
+              <w:rPr>
+                <w:rFonts w:ascii="Arial" w:cs="Arial" w:eastAsia="Arial" w:hAnsi="Arial"/>
+                <w:b w:val="false"/>
+                <w:bCs w:val="false"/>
+                <w:i w:val="false"/>
+                <w:iCs w:val="false"/>
+                <w:sz w:val="20"/>
+                <w:szCs w:val="20"/>
+              </w:rPr>
+              <w:t xml:space="preserve"/>
+            </w:r>
+          </w:p>
+        </w:tc>
+        <w:tc>
+          <w:tcPr>
+            <w:tcW w:type="dxa" w:w="1240"/>
+            <w:tcBorders>
+              <w:top w:val="single" w:color="AAAAAA" w:sz="1"/>
+              <w:left w:val="single" w:color="AAAAAA" w:sz="1"/>
+              <w:bottom w:val="single" w:color="AAAAAA" w:sz="1"/>
+              <w:right w:val="single" w:color="AAAAAA" w:sz="1"/>
+            </w:tcBorders>
+            <w:tcMar>
+              <w:top w:type="dxa" w:w="60"/>
+              <w:left w:type="dxa" w:w="100"/>
+              <w:bottom w:type="dxa" w:w="60"/>
+              <w:right w:type="dxa" w:w="100"/>
+            </w:tcMar>
+          </w:tcPr>
+          <w:p>
+            <w:pPr>
+              <w:jc w:val="center"/>
+            </w:pPr>
+            <w:r>
+              <w:rPr>
+                <w:rFonts w:ascii="Arial" w:cs="Arial" w:eastAsia="Arial" w:hAnsi="Arial"/>
+                <w:b w:val="false"/>
+                <w:bCs w:val="false"/>
+                <w:i w:val="false"/>
+                <w:iCs w:val="false"/>
+                <w:sz w:val="20"/>
+                <w:szCs w:val="20"/>
+              </w:rPr>
+              <w:t xml:space="preserve"/>
+            </w:r>
+          </w:p>
+        </w:tc>
+        <w:tc>
+          <w:tcPr>
+            <w:tcW w:type="dxa" w:w="2000"/>
+            <w:tcBorders>
+              <w:top w:val="single" w:color="AAAAAA" w:sz="1"/>
+              <w:left w:val="single" w:color="AAAAAA" w:sz="1"/>
+              <w:bottom w:val="single" w:color="AAAAAA" w:sz="1"/>
+              <w:right w:val="single" w:color="AAAAAA" w:sz="1"/>
+            </w:tcBorders>
             <w:tcMar>
               <w:top w:type="dxa" w:w="60"/>
               <w:left w:type="dxa" w:w="100"/>

</xml_diff>

<commit_message>
Entity Inventory v1.3 → v1.4: Add Segment entity
Carry-forward update from CR-MARKETING-CONTACTS v1.0.

Changes:
- Version 1.3 → 1.4, Last Updated 04-09-26 23:42
- Entity count 16 → 17 (2 native, 12 custom, 3 TBD)
- Section 2 Entity Map: Segment row added (Custom Base, CR domain)
- Section 4.12 Segment: New sub-section documenting custom Base entity
  owned by CR-MARKETING with two types (Dynamic and Static via immutable
  segmentType enum), 8 custom fields + 1 forward-reference relationship,
  sourced from CR-MARKETING-CONTACTS DAT-044 through DAT-052
- Section 5 Cross-Domain Entity Matrix: Segment row added (CR only,
  domain count 1)
- No new open issues
</commit_message>
<xml_diff>
--- a/PRDs/CBM-Entity-Inventory.docx
+++ b/PRDs/CBM-Entity-Inventory.docx
@@ -300,7 +300,7 @@
           </w:tcPr>
           <w:p>
             <w:r>
-              <w:t>1.3</w:t>
+              <w:t>1.4</w:t>
             </w:r>
           </w:p>
         </w:tc>
@@ -421,7 +421,7 @@
           </w:tcPr>
           <w:p>
             <w:r>
-              <w:t>04-08-26 18:32</w:t>
+              <w:t>04-09-26 23:42</w:t>
             </w:r>
           </w:p>
         </w:tc>
@@ -555,7 +555,7 @@
         <w:spacing w:after="120"/>
       </w:pPr>
       <w:r>
-        <w:t xml:space="preserve">Total CRM Entities: 16 (2 native, 11 custom, 3 TBD)</w:t>
+        <w:t xml:space="preserve">Total CRM Entities: 17 (2 native, 12 custom, 3 TBD)</w:t>
       </w:r>
     </w:p>
     <w:p>
@@ -6577,6 +6577,162 @@
           <w:p>
             <w:r>
               <w:t xml:space="preserve">Campaign Engagement</w:t>
+            </w:r>
+          </w:p>
+        </w:tc>
+        <w:tc>
+          <w:tcPr>
+            <w:tcW w:type="dxa" w:w="900"/>
+            <w:tcBorders>
+              <w:top w:val="single" w:color="AAAAAA" w:sz="1"/>
+              <w:left w:val="single" w:color="AAAAAA" w:sz="1"/>
+              <w:bottom w:val="single" w:color="AAAAAA" w:sz="1"/>
+              <w:right w:val="single" w:color="AAAAAA" w:sz="1"/>
+            </w:tcBorders>
+            <w:tcMar>
+              <w:top w:type="dxa" w:w="60"/>
+              <w:left w:type="dxa" w:w="100"/>
+              <w:bottom w:type="dxa" w:w="60"/>
+              <w:right w:type="dxa" w:w="100"/>
+            </w:tcMar>
+          </w:tcPr>
+          <w:p>
+            <w:r>
+              <w:t xml:space="preserve">Custom</w:t>
+            </w:r>
+          </w:p>
+        </w:tc>
+        <w:tc>
+          <w:tcPr>
+            <w:tcW w:type="dxa" w:w="900"/>
+            <w:tcBorders>
+              <w:top w:val="single" w:color="AAAAAA" w:sz="1"/>
+              <w:left w:val="single" w:color="AAAAAA" w:sz="1"/>
+              <w:bottom w:val="single" w:color="AAAAAA" w:sz="1"/>
+              <w:right w:val="single" w:color="AAAAAA" w:sz="1"/>
+            </w:tcBorders>
+            <w:tcMar>
+              <w:top w:type="dxa" w:w="60"/>
+              <w:left w:type="dxa" w:w="100"/>
+              <w:bottom w:type="dxa" w:w="60"/>
+              <w:right w:type="dxa" w:w="100"/>
+            </w:tcMar>
+          </w:tcPr>
+          <w:p>
+            <w:r>
+              <w:t xml:space="preserve">Base</w:t>
+            </w:r>
+          </w:p>
+        </w:tc>
+        <w:tc>
+          <w:tcPr>
+            <w:tcW w:type="dxa" w:w="1200"/>
+            <w:tcBorders>
+              <w:top w:val="single" w:color="AAAAAA" w:sz="1"/>
+              <w:left w:val="single" w:color="AAAAAA" w:sz="1"/>
+              <w:bottom w:val="single" w:color="AAAAAA" w:sz="1"/>
+              <w:right w:val="single" w:color="AAAAAA" w:sz="1"/>
+            </w:tcBorders>
+            <w:tcMar>
+              <w:top w:type="dxa" w:w="60"/>
+              <w:left w:type="dxa" w:w="100"/>
+              <w:bottom w:type="dxa" w:w="60"/>
+              <w:right w:type="dxa" w:w="100"/>
+            </w:tcMar>
+          </w:tcPr>
+          <w:p>
+            <w:r>
+              <w:t xml:space="preserve">—</w:t>
+            </w:r>
+          </w:p>
+        </w:tc>
+        <w:tc>
+          <w:tcPr>
+            <w:tcW w:type="dxa" w:w="1300"/>
+            <w:tcBorders>
+              <w:top w:val="single" w:color="AAAAAA" w:sz="1"/>
+              <w:left w:val="single" w:color="AAAAAA" w:sz="1"/>
+              <w:bottom w:val="single" w:color="AAAAAA" w:sz="1"/>
+              <w:right w:val="single" w:color="AAAAAA" w:sz="1"/>
+            </w:tcBorders>
+            <w:tcMar>
+              <w:top w:type="dxa" w:w="60"/>
+              <w:left w:type="dxa" w:w="100"/>
+              <w:bottom w:type="dxa" w:w="60"/>
+              <w:right w:type="dxa" w:w="100"/>
+            </w:tcMar>
+          </w:tcPr>
+          <w:p>
+            <w:r>
+              <w:t xml:space="preserve">—</w:t>
+            </w:r>
+          </w:p>
+        </w:tc>
+        <w:tc>
+          <w:tcPr>
+            <w:tcW w:type="dxa" w:w="2160"/>
+            <w:tcBorders>
+              <w:top w:val="single" w:color="AAAAAA" w:sz="1"/>
+              <w:left w:val="single" w:color="AAAAAA" w:sz="1"/>
+              <w:bottom w:val="single" w:color="AAAAAA" w:sz="1"/>
+              <w:right w:val="single" w:color="AAAAAA" w:sz="1"/>
+            </w:tcBorders>
+            <w:tcMar>
+              <w:top w:type="dxa" w:w="60"/>
+              <w:left w:type="dxa" w:w="100"/>
+              <w:bottom w:type="dxa" w:w="60"/>
+              <w:right w:type="dxa" w:w="100"/>
+            </w:tcMar>
+          </w:tcPr>
+          <w:p>
+            <w:r>
+              <w:t xml:space="preserve">CR</w:t>
+            </w:r>
+          </w:p>
+        </w:tc>
+      </w:tr>
+      <w:tr>
+        <w:tc>
+          <w:tcPr>
+            <w:tcW w:type="dxa" w:w="1700"/>
+            <w:tcBorders>
+              <w:top w:val="single" w:color="AAAAAA" w:sz="1"/>
+              <w:left w:val="single" w:color="AAAAAA" w:sz="1"/>
+              <w:bottom w:val="single" w:color="AAAAAA" w:sz="1"/>
+              <w:right w:val="single" w:color="AAAAAA" w:sz="1"/>
+            </w:tcBorders>
+            <w:tcMar>
+              <w:top w:type="dxa" w:w="60"/>
+              <w:left w:type="dxa" w:w="100"/>
+              <w:bottom w:type="dxa" w:w="60"/>
+              <w:right w:type="dxa" w:w="100"/>
+            </w:tcMar>
+          </w:tcPr>
+          <w:p>
+            <w:r>
+              <w:t xml:space="preserve">Segment</w:t>
+            </w:r>
+          </w:p>
+        </w:tc>
+        <w:tc>
+          <w:tcPr>
+            <w:tcW w:type="dxa" w:w="1200"/>
+            <w:tcBorders>
+              <w:top w:val="single" w:color="AAAAAA" w:sz="1"/>
+              <w:left w:val="single" w:color="AAAAAA" w:sz="1"/>
+              <w:bottom w:val="single" w:color="AAAAAA" w:sz="1"/>
+              <w:right w:val="single" w:color="AAAAAA" w:sz="1"/>
+            </w:tcBorders>
+            <w:tcMar>
+              <w:top w:type="dxa" w:w="60"/>
+              <w:left w:type="dxa" w:w="100"/>
+              <w:bottom w:type="dxa" w:w="60"/>
+              <w:right w:type="dxa" w:w="100"/>
+            </w:tcMar>
+          </w:tcPr>
+          <w:p>
+            <w:r>
+              <w:t xml:space="preserve">Segment</w:t>
             </w:r>
           </w:p>
         </w:tc>
@@ -11297,6 +11453,61 @@
     </w:p>
     <w:p>
       <w:pPr>
+        <w:pStyle w:val="Heading2"/>
+        <w:spacing w:after="120" w:before="240"/>
+      </w:pPr>
+      <w:r>
+        <w:t xml:space="preserve">4.12 Segment</w:t>
+      </w:r>
+    </w:p>
+    <w:p>
+      <w:pPr>
+        <w:pStyle w:val="ListParagraph"/>
+        <w:numPr>
+          <w:ilvl w:val="0"/>
+          <w:numId w:val="2"/>
+        </w:numPr>
+        <w:spacing w:after="60"/>
+      </w:pPr>
+    </w:p>
+    <w:p>
+      <w:pPr>
+        <w:pStyle w:val="ListParagraph"/>
+        <w:numPr>
+          <w:ilvl w:val="0"/>
+          <w:numId w:val="2"/>
+        </w:numPr>
+        <w:spacing w:after="60"/>
+      </w:pPr>
+      <w:r>
+        <w:t xml:space="preserve">A contact list management entity used by CR-MARKETING-CONTACTS for building and maintaining audience segments and by CR-MARKETING-CAMPAIGNS as campaign send lists. Two types distinguished by an immutable segmentType enum field: Dynamic segments define membership via stored filter criteria evaluated at view/use time; Static segments maintain an explicit many-to-many relationship to Contact records. Owned exclusively by the CR-MARKETING sub-domain of the Client Recruiting domain. 8 custom fields: name (varchar, required), description (text, optional), segmentType (enum: Dynamic or Static, immutable after creation), filterCriteria (text, required for Dynamic), memberContactIds (many-to-many relationship to Contact, used for Static), owner (relationship to User, system-set at creation), createdAt (datetime, system), modifiedAt (datetime, system). 1 forward-reference relationship: Campaign-to-Segment usage link (to be defined by CR-MARKETING-CAMPAIGNS). Source: CR-MARKETING-CONTACTS v1.0 Section 8, DAT-044 through DAT-052.</w:t>
+      </w:r>
+    </w:p>
+    <w:p>
+      <w:pPr>
+        <w:pStyle w:val="ListParagraph"/>
+        <w:numPr>
+          <w:ilvl w:val="0"/>
+          <w:numId w:val="2"/>
+        </w:numPr>
+        <w:spacing w:after="60"/>
+      </w:pPr>
+      <w:r>
+        <w:t xml:space="preserve">Type Rationale: Base type chosen. Segments are metadata containers for audience selection — no calendar scheduling or event semantics needed. The two segment types (Dynamic and Static) are distinguished by an enum field, not by separate entities, because both types serve the same purpose (defining a list of Contacts for campaign targeting) and share the same core attributes.</w:t>
+      </w:r>
+    </w:p>
+    <w:p>
+      <w:pPr>
+        <w:pStyle w:val="ListParagraph"/>
+        <w:numPr>
+          <w:ilvl w:val="0"/>
+          <w:numId w:val="2"/>
+        </w:numPr>
+        <w:spacing w:after="60"/>
+      </w:pPr>
+    </w:p>
+    <w:p>
+      <w:pPr>
         <w:pStyle w:val="Heading1"/>
         <w:spacing w:after="120" w:before="360"/>
       </w:pPr>
@@ -14557,6 +14768,161 @@
           <w:p>
             <w:r>
               <w:t xml:space="preserve">Campaign Engagement</w:t>
+            </w:r>
+          </w:p>
+        </w:tc>
+        <w:tc>
+          <w:tcPr>
+            <w:tcW w:type="dxa" w:w="1240"/>
+            <w:tcBorders>
+              <w:top w:val="single" w:color="AAAAAA" w:sz="1"/>
+              <w:left w:val="single" w:color="AAAAAA" w:sz="1"/>
+              <w:bottom w:val="single" w:color="AAAAAA" w:sz="1"/>
+              <w:right w:val="single" w:color="AAAAAA" w:sz="1"/>
+            </w:tcBorders>
+            <w:shd w:fill="F2F7FB" w:val="clear"/>
+            <w:tcMar>
+              <w:top w:type="dxa" w:w="60"/>
+              <w:left w:type="dxa" w:w="100"/>
+              <w:bottom w:type="dxa" w:w="60"/>
+              <w:right w:type="dxa" w:w="100"/>
+            </w:tcMar>
+          </w:tcPr>
+          <w:p>
+            <w:pPr>
+              <w:jc w:val="center"/>
+            </w:pPr>
+            <w:r>
+              <w:t xml:space="preserve"/>
+            </w:r>
+          </w:p>
+        </w:tc>
+        <w:tc>
+          <w:tcPr>
+            <w:tcW w:type="dxa" w:w="1240"/>
+            <w:tcBorders>
+              <w:top w:val="single" w:color="AAAAAA" w:sz="1"/>
+              <w:left w:val="single" w:color="AAAAAA" w:sz="1"/>
+              <w:bottom w:val="single" w:color="AAAAAA" w:sz="1"/>
+              <w:right w:val="single" w:color="AAAAAA" w:sz="1"/>
+            </w:tcBorders>
+            <w:shd w:fill="F2F7FB" w:val="clear"/>
+            <w:tcMar>
+              <w:top w:type="dxa" w:w="60"/>
+              <w:left w:type="dxa" w:w="100"/>
+              <w:bottom w:type="dxa" w:w="60"/>
+              <w:right w:type="dxa" w:w="100"/>
+            </w:tcMar>
+          </w:tcPr>
+          <w:p>
+            <w:pPr>
+              <w:jc w:val="center"/>
+            </w:pPr>
+            <w:r>
+              <w:t xml:space="preserve"/>
+            </w:r>
+          </w:p>
+        </w:tc>
+        <w:tc>
+          <w:tcPr>
+            <w:tcW w:type="dxa" w:w="1240"/>
+            <w:tcBorders>
+              <w:top w:val="single" w:color="AAAAAA" w:sz="1"/>
+              <w:left w:val="single" w:color="AAAAAA" w:sz="1"/>
+              <w:bottom w:val="single" w:color="AAAAAA" w:sz="1"/>
+              <w:right w:val="single" w:color="AAAAAA" w:sz="1"/>
+            </w:tcBorders>
+            <w:shd w:fill="F2F7FB" w:val="clear"/>
+            <w:tcMar>
+              <w:top w:type="dxa" w:w="60"/>
+              <w:left w:type="dxa" w:w="100"/>
+              <w:bottom w:type="dxa" w:w="60"/>
+              <w:right w:type="dxa" w:w="100"/>
+            </w:tcMar>
+          </w:tcPr>
+          <w:p>
+            <w:pPr>
+              <w:jc w:val="center"/>
+            </w:pPr>
+            <w:r>
+              <w:t xml:space="preserve">✓</w:t>
+            </w:r>
+          </w:p>
+        </w:tc>
+        <w:tc>
+          <w:tcPr>
+            <w:tcW w:type="dxa" w:w="1240"/>
+            <w:tcBorders>
+              <w:top w:val="single" w:color="AAAAAA" w:sz="1"/>
+              <w:left w:val="single" w:color="AAAAAA" w:sz="1"/>
+              <w:bottom w:val="single" w:color="AAAAAA" w:sz="1"/>
+              <w:right w:val="single" w:color="AAAAAA" w:sz="1"/>
+            </w:tcBorders>
+            <w:shd w:fill="F2F7FB" w:val="clear"/>
+            <w:tcMar>
+              <w:top w:type="dxa" w:w="60"/>
+              <w:left w:type="dxa" w:w="100"/>
+              <w:bottom w:type="dxa" w:w="60"/>
+              <w:right w:type="dxa" w:w="100"/>
+            </w:tcMar>
+          </w:tcPr>
+          <w:p>
+            <w:pPr>
+              <w:jc w:val="center"/>
+            </w:pPr>
+            <w:r>
+              <w:t xml:space="preserve"/>
+            </w:r>
+          </w:p>
+        </w:tc>
+        <w:tc>
+          <w:tcPr>
+            <w:tcW w:type="dxa" w:w="2000"/>
+            <w:tcBorders>
+              <w:top w:val="single" w:color="AAAAAA" w:sz="1"/>
+              <w:left w:val="single" w:color="AAAAAA" w:sz="1"/>
+              <w:bottom w:val="single" w:color="AAAAAA" w:sz="1"/>
+              <w:right w:val="single" w:color="AAAAAA" w:sz="1"/>
+            </w:tcBorders>
+            <w:shd w:fill="F2F7FB" w:val="clear"/>
+            <w:tcMar>
+              <w:top w:type="dxa" w:w="60"/>
+              <w:left w:type="dxa" w:w="100"/>
+              <w:bottom w:type="dxa" w:w="60"/>
+              <w:right w:type="dxa" w:w="100"/>
+            </w:tcMar>
+          </w:tcPr>
+          <w:p>
+            <w:pPr>
+              <w:jc w:val="center"/>
+            </w:pPr>
+            <w:r>
+              <w:t xml:space="preserve">1</w:t>
+            </w:r>
+          </w:p>
+        </w:tc>
+      </w:tr>
+      <w:tr>
+        <w:tc>
+          <w:tcPr>
+            <w:tcW w:type="dxa" w:w="2400"/>
+            <w:tcBorders>
+              <w:top w:val="single" w:color="AAAAAA" w:sz="1"/>
+              <w:left w:val="single" w:color="AAAAAA" w:sz="1"/>
+              <w:bottom w:val="single" w:color="AAAAAA" w:sz="1"/>
+              <w:right w:val="single" w:color="AAAAAA" w:sz="1"/>
+            </w:tcBorders>
+            <w:shd w:fill="F2F7FB" w:val="clear"/>
+            <w:tcMar>
+              <w:top w:type="dxa" w:w="60"/>
+              <w:left w:type="dxa" w:w="100"/>
+              <w:bottom w:type="dxa" w:w="60"/>
+              <w:right w:type="dxa" w:w="100"/>
+            </w:tcMar>
+          </w:tcPr>
+          <w:p>
+            <w:r>
+              <w:t xml:space="preserve">Segment</w:t>
             </w:r>
           </w:p>
         </w:tc>

</xml_diff>

<commit_message>
Entity Inventory v1.4 → v1.5: CR Phase 2b Entity PRDs complete
Version bump to reflect seven CR-domain Entity PRDs now at v1.0:
Event, Event Registration, Partnership Agreement, Segment,
Campaign Group, Marketing Campaign, Campaign Engagement.

No structural changes — all seven entities already had rows.
Version and Last Updated date updated.
</commit_message>
<xml_diff>
--- a/PRDs/CBM-Entity-Inventory.docx
+++ b/PRDs/CBM-Entity-Inventory.docx
@@ -300,7 +300,7 @@
           </w:tcPr>
           <w:p>
             <w:r>
-              <w:t>1.4</w:t>
+              <w:t>1.5</w:t>
             </w:r>
           </w:p>
         </w:tc>
@@ -421,7 +421,7 @@
           </w:tcPr>
           <w:p>
             <w:r>
-              <w:t>04-09-26 23:42</w:t>
+              <w:t>04-18-26 10:00</w:t>
             </w:r>
           </w:p>
         </w:tc>

</xml_diff>